<commit_message>
feat(figures): redraw every figure with the scientific-visualization skill
scripts/figures.py redraws the 21 manuscript, SI and calibration figures from
the saved outputs (no re-simulation) as 300 dpi PNG plus editable SVG at PLOS
widths, using the user-level scientific-visualization skill. scenarios_2026.R
also writes the per-draw stratum and item cost totals that the cost figures
need; every other scenario CSV is unchanged (byte-identical rerun).

Co-Authored-By: Claude Opus 5.5 <noreply@anthropic.com>
</commit_message>
<xml_diff>
--- a/docs/Supplementary Information.docx
+++ b/docs/Supplementary Information.docx
@@ -8500,7 +8500,7 @@
       <w:r>
         <w:drawing>
           <wp:inline>
-            <wp:extent cx="5334000" cy="2844800"/>
+            <wp:extent cx="5334000" cy="2377778"/>
             <wp:effectExtent b="0" l="0" r="0" t="0"/>
             <wp:docPr descr="Fig S1. Calibration of age specific seroprevalence and prison population in 2015. Target intervals are compared with 95% posterior predictive intervals from the MCMC posterior and, for contrast, single round neural posterior estimation." title="" id="21" name="Picture"/>
             <a:graphic>
@@ -8521,7 +8521,7 @@
                   <pic:spPr bwMode="auto">
                     <a:xfrm>
                       <a:off x="0" y="0"/>
-                      <a:ext cx="5334000" cy="2844800"/>
+                      <a:ext cx="5334000" cy="2377778"/>
                     </a:xfrm>
                     <a:prstGeom prst="rect">
                       <a:avLst/>
@@ -11764,7 +11764,7 @@
       <w:r>
         <w:drawing>
           <wp:inline>
-            <wp:extent cx="5334000" cy="2424545"/>
+            <wp:extent cx="5334000" cy="6019122"/>
             <wp:effectExtent b="0" l="0" r="0" t="0"/>
             <wp:docPr descr="Fig S2. Trajectories of new infections and HCV deaths relative to 2015 (left) and reductions in 2030 (right) in all 17 scenarios. Medians across posterior draws." title="" id="31" name="Picture"/>
             <a:graphic>
@@ -11785,7 +11785,7 @@
                   <pic:spPr bwMode="auto">
                     <a:xfrm>
                       <a:off x="0" y="0"/>
-                      <a:ext cx="5334000" cy="2424545"/>
+                      <a:ext cx="5334000" cy="6019122"/>
                     </a:xfrm>
                     <a:prstGeom prst="rect">
                       <a:avLst/>
@@ -11819,7 +11819,7 @@
       <w:r>
         <w:drawing>
           <wp:inline>
-            <wp:extent cx="4800600" cy="4000500"/>
+            <wp:extent cx="4767724" cy="5416061"/>
             <wp:effectExtent b="0" l="0" r="0" t="0"/>
             <wp:docPr descr="Fig S3. Attainment of the 2030 targets by scenario. Cells show median reductions. Joint status requires both targets." title="" id="34" name="Picture"/>
             <a:graphic>
@@ -11840,7 +11840,7 @@
                   <pic:spPr bwMode="auto">
                     <a:xfrm>
                       <a:off x="0" y="0"/>
-                      <a:ext cx="4800600" cy="4000500"/>
+                      <a:ext cx="4767724" cy="5416061"/>
                     </a:xfrm>
                     <a:prstGeom prst="rect">
                       <a:avLst/>
@@ -13346,7 +13346,7 @@
       <w:r>
         <w:drawing>
           <wp:inline>
-            <wp:extent cx="5334000" cy="2963333"/>
+            <wp:extent cx="5334000" cy="3638973"/>
             <wp:effectExtent b="0" l="0" r="0" t="0"/>
             <wp:docPr descr="Fig S4. Annual treatment starts and screening derived treatment quotas in F and X, by capacity and allocation. Medians across posterior draws." title="" id="38" name="Picture"/>
             <a:graphic>
@@ -13367,7 +13367,7 @@
                   <pic:spPr bwMode="auto">
                     <a:xfrm>
                       <a:off x="0" y="0"/>
-                      <a:ext cx="5334000" cy="2963333"/>
+                      <a:ext cx="5334000" cy="3638973"/>
                     </a:xfrm>
                     <a:prstGeom prst="rect">
                       <a:avLst/>
@@ -13401,7 +13401,7 @@
       <w:r>
         <w:drawing>
           <wp:inline>
-            <wp:extent cx="4800600" cy="2400300"/>
+            <wp:extent cx="4800600" cy="2014118"/>
             <wp:effectExtent b="0" l="0" r="0" t="0"/>
             <wp:docPr descr="Fig S5. Share of the five year screening quota used in F and X. The F group is small, so a large F share leaves part of its quota unused." title="" id="41" name="Picture"/>
             <a:graphic>
@@ -13422,7 +13422,7 @@
                   <pic:spPr bwMode="auto">
                     <a:xfrm>
                       <a:off x="0" y="0"/>
-                      <a:ext cx="4800600" cy="2400300"/>
+                      <a:ext cx="4800600" cy="2014118"/>
                     </a:xfrm>
                     <a:prstGeom prst="rect">
                       <a:avLst/>
@@ -13456,7 +13456,7 @@
       <w:r>
         <w:drawing>
           <wp:inline>
-            <wp:extent cx="5334000" cy="1546860"/>
+            <wp:extent cx="4767724" cy="2706501"/>
             <wp:effectExtent b="0" l="0" r="0" t="0"/>
             <wp:docPr descr="Fig S6. Cost composition of the prison only scenario and the scenarios that met both targets. Shares use the median cost of each item." title="" id="44" name="Picture"/>
             <a:graphic>
@@ -13477,7 +13477,7 @@
                   <pic:spPr bwMode="auto">
                     <a:xfrm>
                       <a:off x="0" y="0"/>
-                      <a:ext cx="5334000" cy="1546860"/>
+                      <a:ext cx="4767724" cy="2706501"/>
                     </a:xfrm>
                     <a:prstGeom prst="rect">
                       <a:avLst/>
@@ -13511,7 +13511,7 @@
       <w:r>
         <w:drawing>
           <wp:inline>
-            <wp:extent cx="5334000" cy="3333749"/>
+            <wp:extent cx="5334000" cy="3638973"/>
             <wp:effectExtent b="0" l="0" r="0" t="0"/>
             <wp:docPr descr="Fig S7. Discounted costs and treatment starts by group, 2026 to 2030. Segments show the median for each group. Labels show the median total." title="" id="47" name="Picture"/>
             <a:graphic>
@@ -13532,7 +13532,7 @@
                   <pic:spPr bwMode="auto">
                     <a:xfrm>
                       <a:off x="0" y="0"/>
-                      <a:ext cx="5334000" cy="3333749"/>
+                      <a:ext cx="5334000" cy="3638973"/>
                     </a:xfrm>
                     <a:prstGeom prst="rect">
                       <a:avLst/>

</xml_diff>

<commit_message>
feat(scenarios): rerun the treatment scenarios with entry held at 2015
Rerun the 2,000-draw scenario analysis and the NPE policy comparison with entry
into D held at the 2015 counts. J only now cuts 2030 incidence by 84.5% (target
met in 77% of draws) and mortality by 54.9%; the same four scenarios meet the
mortality target at the median (5,000 and 8,000 tests a year with 25% or 50% to
F; both targets in 95%, 51%, 98% and 99% of draws). Without treatment, 2030
incidence equals the 2015 level.

Redraw the figures and rebuild the manuscript: the entry wording and Table S2
describe the constant 2015 counts, and three claims flagged by the audit are
corrected and asserted (the cheapest scenario passing in at least 95% of draws,
the NPE agreement applying to reductions not costs, and deaths described for F
and X together). Update the evaluation, training, NPE report and scenario docs.

Co-Authored-By: Claude Opus 5.5 <noreply@anthropic.com>
</commit_message>
<xml_diff>
--- a/docs/Supplementary Information.docx
+++ b/docs/Supplementary Information.docx
@@ -4805,7 +4805,7 @@
         <w:pStyle w:val="FirstParagraph"/>
       </w:pPr>
       <w:r>
-        <w:t xml:space="preserve">From 2016 to 2025, entry into D followed the annual number of new drug users by age published by the Singapore Department of Statistics</w:t>
+        <w:t xml:space="preserve">Entry into D was the 2015 number of new drug users by age published by the Singapore Department of Statistics</w:t>
       </w:r>
       <w:r>
         <w:t xml:space="preserve"> </w:t>
@@ -4817,7 +4817,7 @@
         <w:t xml:space="preserve"> </w:t>
       </w:r>
       <w:r>
-        <w:t xml:space="preserve">(Table S2). The counts were used without scaling, so the 2015 row is also the equilibrium entry rate. The 2025 value was held constant to 2030. These counts come from law enforcement records and are a proxy for entry into injecting.</w:t>
+        <w:t xml:space="preserve">(Table S2), without scaling. The same counts set the equilibrium up to 2015 and were held constant from 2016 to 2030, so the projections isolate the effect of treatment and screening. These counts come from law enforcement records and are a proxy for entry into injecting.</w:t>
       </w:r>
     </w:p>
     <w:p>
@@ -4829,7 +4829,7 @@
           <w:b/>
           <w:bCs/>
         </w:rPr>
-        <w:t xml:space="preserve">Table S2. New drug users by age group, Singapore, 2015 to 2025.</w:t>
+        <w:t xml:space="preserve">Table S2. New drug users by age group, Singapore, 2015 (entry into D in every model year).</w:t>
       </w:r>
     </w:p>
     <w:tbl>
@@ -5008,796 +5008,6 @@
           </w:p>
         </w:tc>
       </w:tr>
-      <w:tr>
-        <w:tc>
-          <w:tcPr/>
-          <w:p>
-            <w:pPr>
-              <w:pStyle w:val="Compact"/>
-            </w:pPr>
-            <w:r>
-              <w:t xml:space="preserve">2016</w:t>
-            </w:r>
-          </w:p>
-        </w:tc>
-        <w:tc>
-          <w:tcPr/>
-          <w:p>
-            <w:pPr>
-              <w:pStyle w:val="Compact"/>
-            </w:pPr>
-            <w:r>
-              <w:t xml:space="preserve">244</w:t>
-            </w:r>
-          </w:p>
-        </w:tc>
-        <w:tc>
-          <w:tcPr/>
-          <w:p>
-            <w:pPr>
-              <w:pStyle w:val="Compact"/>
-            </w:pPr>
-            <w:r>
-              <w:t xml:space="preserve">650</w:t>
-            </w:r>
-          </w:p>
-        </w:tc>
-        <w:tc>
-          <w:tcPr/>
-          <w:p>
-            <w:pPr>
-              <w:pStyle w:val="Compact"/>
-            </w:pPr>
-            <w:r>
-              <w:t xml:space="preserve">313</w:t>
-            </w:r>
-          </w:p>
-        </w:tc>
-        <w:tc>
-          <w:tcPr/>
-          <w:p>
-            <w:pPr>
-              <w:pStyle w:val="Compact"/>
-            </w:pPr>
-            <w:r>
-              <w:t xml:space="preserve">110</w:t>
-            </w:r>
-          </w:p>
-        </w:tc>
-        <w:tc>
-          <w:tcPr/>
-          <w:p>
-            <w:pPr>
-              <w:pStyle w:val="Compact"/>
-            </w:pPr>
-            <w:r>
-              <w:t xml:space="preserve">27</w:t>
-            </w:r>
-          </w:p>
-        </w:tc>
-        <w:tc>
-          <w:tcPr/>
-          <w:p>
-            <w:pPr>
-              <w:pStyle w:val="Compact"/>
-            </w:pPr>
-            <w:r>
-              <w:t xml:space="preserve">4</w:t>
-            </w:r>
-          </w:p>
-        </w:tc>
-      </w:tr>
-      <w:tr>
-        <w:tc>
-          <w:tcPr/>
-          <w:p>
-            <w:pPr>
-              <w:pStyle w:val="Compact"/>
-            </w:pPr>
-            <w:r>
-              <w:t xml:space="preserve">2017</w:t>
-            </w:r>
-          </w:p>
-        </w:tc>
-        <w:tc>
-          <w:tcPr/>
-          <w:p>
-            <w:pPr>
-              <w:pStyle w:val="Compact"/>
-            </w:pPr>
-            <w:r>
-              <w:t xml:space="preserve">235</w:t>
-            </w:r>
-          </w:p>
-        </w:tc>
-        <w:tc>
-          <w:tcPr/>
-          <w:p>
-            <w:pPr>
-              <w:pStyle w:val="Compact"/>
-            </w:pPr>
-            <w:r>
-              <w:t xml:space="preserve">565</w:t>
-            </w:r>
-          </w:p>
-        </w:tc>
-        <w:tc>
-          <w:tcPr/>
-          <w:p>
-            <w:pPr>
-              <w:pStyle w:val="Compact"/>
-            </w:pPr>
-            <w:r>
-              <w:t xml:space="preserve">301</w:t>
-            </w:r>
-          </w:p>
-        </w:tc>
-        <w:tc>
-          <w:tcPr/>
-          <w:p>
-            <w:pPr>
-              <w:pStyle w:val="Compact"/>
-            </w:pPr>
-            <w:r>
-              <w:t xml:space="preserve">111</w:t>
-            </w:r>
-          </w:p>
-        </w:tc>
-        <w:tc>
-          <w:tcPr/>
-          <w:p>
-            <w:pPr>
-              <w:pStyle w:val="Compact"/>
-            </w:pPr>
-            <w:r>
-              <w:t xml:space="preserve">33</w:t>
-            </w:r>
-          </w:p>
-        </w:tc>
-        <w:tc>
-          <w:tcPr/>
-          <w:p>
-            <w:pPr>
-              <w:pStyle w:val="Compact"/>
-            </w:pPr>
-            <w:r>
-              <w:t xml:space="preserve">4</w:t>
-            </w:r>
-          </w:p>
-        </w:tc>
-      </w:tr>
-      <w:tr>
-        <w:tc>
-          <w:tcPr/>
-          <w:p>
-            <w:pPr>
-              <w:pStyle w:val="Compact"/>
-            </w:pPr>
-            <w:r>
-              <w:t xml:space="preserve">2018</w:t>
-            </w:r>
-          </w:p>
-        </w:tc>
-        <w:tc>
-          <w:tcPr/>
-          <w:p>
-            <w:pPr>
-              <w:pStyle w:val="Compact"/>
-            </w:pPr>
-            <w:r>
-              <w:t xml:space="preserve">305</w:t>
-            </w:r>
-          </w:p>
-        </w:tc>
-        <w:tc>
-          <w:tcPr/>
-          <w:p>
-            <w:pPr>
-              <w:pStyle w:val="Compact"/>
-            </w:pPr>
-            <w:r>
-              <w:t xml:space="preserve">570</w:t>
-            </w:r>
-          </w:p>
-        </w:tc>
-        <w:tc>
-          <w:tcPr/>
-          <w:p>
-            <w:pPr>
-              <w:pStyle w:val="Compact"/>
-            </w:pPr>
-            <w:r>
-              <w:t xml:space="preserve">303</w:t>
-            </w:r>
-          </w:p>
-        </w:tc>
-        <w:tc>
-          <w:tcPr/>
-          <w:p>
-            <w:pPr>
-              <w:pStyle w:val="Compact"/>
-            </w:pPr>
-            <w:r>
-              <w:t xml:space="preserve">138</w:t>
-            </w:r>
-          </w:p>
-        </w:tc>
-        <w:tc>
-          <w:tcPr/>
-          <w:p>
-            <w:pPr>
-              <w:pStyle w:val="Compact"/>
-            </w:pPr>
-            <w:r>
-              <w:t xml:space="preserve">36</w:t>
-            </w:r>
-          </w:p>
-        </w:tc>
-        <w:tc>
-          <w:tcPr/>
-          <w:p>
-            <w:pPr>
-              <w:pStyle w:val="Compact"/>
-            </w:pPr>
-            <w:r>
-              <w:t xml:space="preserve">12</w:t>
-            </w:r>
-          </w:p>
-        </w:tc>
-      </w:tr>
-      <w:tr>
-        <w:tc>
-          <w:tcPr/>
-          <w:p>
-            <w:pPr>
-              <w:pStyle w:val="Compact"/>
-            </w:pPr>
-            <w:r>
-              <w:t xml:space="preserve">2019</w:t>
-            </w:r>
-          </w:p>
-        </w:tc>
-        <w:tc>
-          <w:tcPr/>
-          <w:p>
-            <w:pPr>
-              <w:pStyle w:val="Compact"/>
-            </w:pPr>
-            <w:r>
-              <w:t xml:space="preserve">309</w:t>
-            </w:r>
-          </w:p>
-        </w:tc>
-        <w:tc>
-          <w:tcPr/>
-          <w:p>
-            <w:pPr>
-              <w:pStyle w:val="Compact"/>
-            </w:pPr>
-            <w:r>
-              <w:t xml:space="preserve">594</w:t>
-            </w:r>
-          </w:p>
-        </w:tc>
-        <w:tc>
-          <w:tcPr/>
-          <w:p>
-            <w:pPr>
-              <w:pStyle w:val="Compact"/>
-            </w:pPr>
-            <w:r>
-              <w:t xml:space="preserve">341</w:t>
-            </w:r>
-          </w:p>
-        </w:tc>
-        <w:tc>
-          <w:tcPr/>
-          <w:p>
-            <w:pPr>
-              <w:pStyle w:val="Compact"/>
-            </w:pPr>
-            <w:r>
-              <w:t xml:space="preserve">130</w:t>
-            </w:r>
-          </w:p>
-        </w:tc>
-        <w:tc>
-          <w:tcPr/>
-          <w:p>
-            <w:pPr>
-              <w:pStyle w:val="Compact"/>
-            </w:pPr>
-            <w:r>
-              <w:t xml:space="preserve">70</w:t>
-            </w:r>
-          </w:p>
-        </w:tc>
-        <w:tc>
-          <w:tcPr/>
-          <w:p>
-            <w:pPr>
-              <w:pStyle w:val="Compact"/>
-            </w:pPr>
-            <w:r>
-              <w:t xml:space="preserve">16</w:t>
-            </w:r>
-          </w:p>
-        </w:tc>
-      </w:tr>
-      <w:tr>
-        <w:tc>
-          <w:tcPr/>
-          <w:p>
-            <w:pPr>
-              <w:pStyle w:val="Compact"/>
-            </w:pPr>
-            <w:r>
-              <w:t xml:space="preserve">2020</w:t>
-            </w:r>
-          </w:p>
-        </w:tc>
-        <w:tc>
-          <w:tcPr/>
-          <w:p>
-            <w:pPr>
-              <w:pStyle w:val="Compact"/>
-            </w:pPr>
-            <w:r>
-              <w:t xml:space="preserve">228</w:t>
-            </w:r>
-          </w:p>
-        </w:tc>
-        <w:tc>
-          <w:tcPr/>
-          <w:p>
-            <w:pPr>
-              <w:pStyle w:val="Compact"/>
-            </w:pPr>
-            <w:r>
-              <w:t xml:space="preserve">488</w:t>
-            </w:r>
-          </w:p>
-        </w:tc>
-        <w:tc>
-          <w:tcPr/>
-          <w:p>
-            <w:pPr>
-              <w:pStyle w:val="Compact"/>
-            </w:pPr>
-            <w:r>
-              <w:t xml:space="preserve">252</w:t>
-            </w:r>
-          </w:p>
-        </w:tc>
-        <w:tc>
-          <w:tcPr/>
-          <w:p>
-            <w:pPr>
-              <w:pStyle w:val="Compact"/>
-            </w:pPr>
-            <w:r>
-              <w:t xml:space="preserve">112</w:t>
-            </w:r>
-          </w:p>
-        </w:tc>
-        <w:tc>
-          <w:tcPr/>
-          <w:p>
-            <w:pPr>
-              <w:pStyle w:val="Compact"/>
-            </w:pPr>
-            <w:r>
-              <w:t xml:space="preserve">58</w:t>
-            </w:r>
-          </w:p>
-        </w:tc>
-        <w:tc>
-          <w:tcPr/>
-          <w:p>
-            <w:pPr>
-              <w:pStyle w:val="Compact"/>
-            </w:pPr>
-            <w:r>
-              <w:t xml:space="preserve">13</w:t>
-            </w:r>
-          </w:p>
-        </w:tc>
-      </w:tr>
-      <w:tr>
-        <w:tc>
-          <w:tcPr/>
-          <w:p>
-            <w:pPr>
-              <w:pStyle w:val="Compact"/>
-            </w:pPr>
-            <w:r>
-              <w:t xml:space="preserve">2021</w:t>
-            </w:r>
-          </w:p>
-        </w:tc>
-        <w:tc>
-          <w:tcPr/>
-          <w:p>
-            <w:pPr>
-              <w:pStyle w:val="Compact"/>
-            </w:pPr>
-            <w:r>
-              <w:t xml:space="preserve">152</w:t>
-            </w:r>
-          </w:p>
-        </w:tc>
-        <w:tc>
-          <w:tcPr/>
-          <w:p>
-            <w:pPr>
-              <w:pStyle w:val="Compact"/>
-            </w:pPr>
-            <w:r>
-              <w:t xml:space="preserve">408</w:t>
-            </w:r>
-          </w:p>
-        </w:tc>
-        <w:tc>
-          <w:tcPr/>
-          <w:p>
-            <w:pPr>
-              <w:pStyle w:val="Compact"/>
-            </w:pPr>
-            <w:r>
-              <w:t xml:space="preserve">226</w:t>
-            </w:r>
-          </w:p>
-        </w:tc>
-        <w:tc>
-          <w:tcPr/>
-          <w:p>
-            <w:pPr>
-              <w:pStyle w:val="Compact"/>
-            </w:pPr>
-            <w:r>
-              <w:t xml:space="preserve">97</w:t>
-            </w:r>
-          </w:p>
-        </w:tc>
-        <w:tc>
-          <w:tcPr/>
-          <w:p>
-            <w:pPr>
-              <w:pStyle w:val="Compact"/>
-            </w:pPr>
-            <w:r>
-              <w:t xml:space="preserve">40</w:t>
-            </w:r>
-          </w:p>
-        </w:tc>
-        <w:tc>
-          <w:tcPr/>
-          <w:p>
-            <w:pPr>
-              <w:pStyle w:val="Compact"/>
-            </w:pPr>
-            <w:r>
-              <w:t xml:space="preserve">13</w:t>
-            </w:r>
-          </w:p>
-        </w:tc>
-      </w:tr>
-      <w:tr>
-        <w:tc>
-          <w:tcPr/>
-          <w:p>
-            <w:pPr>
-              <w:pStyle w:val="Compact"/>
-            </w:pPr>
-            <w:r>
-              <w:t xml:space="preserve">2022</w:t>
-            </w:r>
-          </w:p>
-        </w:tc>
-        <w:tc>
-          <w:tcPr/>
-          <w:p>
-            <w:pPr>
-              <w:pStyle w:val="Compact"/>
-            </w:pPr>
-            <w:r>
-              <w:t xml:space="preserve">83</w:t>
-            </w:r>
-          </w:p>
-        </w:tc>
-        <w:tc>
-          <w:tcPr/>
-          <w:p>
-            <w:pPr>
-              <w:pStyle w:val="Compact"/>
-            </w:pPr>
-            <w:r>
-              <w:t xml:space="preserve">317</w:t>
-            </w:r>
-          </w:p>
-        </w:tc>
-        <w:tc>
-          <w:tcPr/>
-          <w:p>
-            <w:pPr>
-              <w:pStyle w:val="Compact"/>
-            </w:pPr>
-            <w:r>
-              <w:t xml:space="preserve">250</w:t>
-            </w:r>
-          </w:p>
-        </w:tc>
-        <w:tc>
-          <w:tcPr/>
-          <w:p>
-            <w:pPr>
-              <w:pStyle w:val="Compact"/>
-            </w:pPr>
-            <w:r>
-              <w:t xml:space="preserve">101</w:t>
-            </w:r>
-          </w:p>
-        </w:tc>
-        <w:tc>
-          <w:tcPr/>
-          <w:p>
-            <w:pPr>
-              <w:pStyle w:val="Compact"/>
-            </w:pPr>
-            <w:r>
-              <w:t xml:space="preserve">33</w:t>
-            </w:r>
-          </w:p>
-        </w:tc>
-        <w:tc>
-          <w:tcPr/>
-          <w:p>
-            <w:pPr>
-              <w:pStyle w:val="Compact"/>
-            </w:pPr>
-            <w:r>
-              <w:t xml:space="preserve">18</w:t>
-            </w:r>
-          </w:p>
-        </w:tc>
-      </w:tr>
-      <w:tr>
-        <w:tc>
-          <w:tcPr/>
-          <w:p>
-            <w:pPr>
-              <w:pStyle w:val="Compact"/>
-            </w:pPr>
-            <w:r>
-              <w:t xml:space="preserve">2023</w:t>
-            </w:r>
-          </w:p>
-        </w:tc>
-        <w:tc>
-          <w:tcPr/>
-          <w:p>
-            <w:pPr>
-              <w:pStyle w:val="Compact"/>
-            </w:pPr>
-            <w:r>
-              <w:t xml:space="preserve">97</w:t>
-            </w:r>
-          </w:p>
-        </w:tc>
-        <w:tc>
-          <w:tcPr/>
-          <w:p>
-            <w:pPr>
-              <w:pStyle w:val="Compact"/>
-            </w:pPr>
-            <w:r>
-              <w:t xml:space="preserve">391</w:t>
-            </w:r>
-          </w:p>
-        </w:tc>
-        <w:tc>
-          <w:tcPr/>
-          <w:p>
-            <w:pPr>
-              <w:pStyle w:val="Compact"/>
-            </w:pPr>
-            <w:r>
-              <w:t xml:space="preserve">281</w:t>
-            </w:r>
-          </w:p>
-        </w:tc>
-        <w:tc>
-          <w:tcPr/>
-          <w:p>
-            <w:pPr>
-              <w:pStyle w:val="Compact"/>
-            </w:pPr>
-            <w:r>
-              <w:t xml:space="preserve">123</w:t>
-            </w:r>
-          </w:p>
-        </w:tc>
-        <w:tc>
-          <w:tcPr/>
-          <w:p>
-            <w:pPr>
-              <w:pStyle w:val="Compact"/>
-            </w:pPr>
-            <w:r>
-              <w:t xml:space="preserve">52</w:t>
-            </w:r>
-          </w:p>
-        </w:tc>
-        <w:tc>
-          <w:tcPr/>
-          <w:p>
-            <w:pPr>
-              <w:pStyle w:val="Compact"/>
-            </w:pPr>
-            <w:r>
-              <w:t xml:space="preserve">8</w:t>
-            </w:r>
-          </w:p>
-        </w:tc>
-      </w:tr>
-      <w:tr>
-        <w:tc>
-          <w:tcPr/>
-          <w:p>
-            <w:pPr>
-              <w:pStyle w:val="Compact"/>
-            </w:pPr>
-            <w:r>
-              <w:t xml:space="preserve">2024</w:t>
-            </w:r>
-          </w:p>
-        </w:tc>
-        <w:tc>
-          <w:tcPr/>
-          <w:p>
-            <w:pPr>
-              <w:pStyle w:val="Compact"/>
-            </w:pPr>
-            <w:r>
-              <w:t xml:space="preserve">134</w:t>
-            </w:r>
-          </w:p>
-        </w:tc>
-        <w:tc>
-          <w:tcPr/>
-          <w:p>
-            <w:pPr>
-              <w:pStyle w:val="Compact"/>
-            </w:pPr>
-            <w:r>
-              <w:t xml:space="preserve">401</w:t>
-            </w:r>
-          </w:p>
-        </w:tc>
-        <w:tc>
-          <w:tcPr/>
-          <w:p>
-            <w:pPr>
-              <w:pStyle w:val="Compact"/>
-            </w:pPr>
-            <w:r>
-              <w:t xml:space="preserve">286</w:t>
-            </w:r>
-          </w:p>
-        </w:tc>
-        <w:tc>
-          <w:tcPr/>
-          <w:p>
-            <w:pPr>
-              <w:pStyle w:val="Compact"/>
-            </w:pPr>
-            <w:r>
-              <w:t xml:space="preserve">116</w:t>
-            </w:r>
-          </w:p>
-        </w:tc>
-        <w:tc>
-          <w:tcPr/>
-          <w:p>
-            <w:pPr>
-              <w:pStyle w:val="Compact"/>
-            </w:pPr>
-            <w:r>
-              <w:t xml:space="preserve">48</w:t>
-            </w:r>
-          </w:p>
-        </w:tc>
-        <w:tc>
-          <w:tcPr/>
-          <w:p>
-            <w:pPr>
-              <w:pStyle w:val="Compact"/>
-            </w:pPr>
-            <w:r>
-              <w:t xml:space="preserve">11</w:t>
-            </w:r>
-          </w:p>
-        </w:tc>
-      </w:tr>
-      <w:tr>
-        <w:tc>
-          <w:tcPr/>
-          <w:p>
-            <w:pPr>
-              <w:pStyle w:val="Compact"/>
-            </w:pPr>
-            <w:r>
-              <w:t xml:space="preserve">2025</w:t>
-            </w:r>
-          </w:p>
-        </w:tc>
-        <w:tc>
-          <w:tcPr/>
-          <w:p>
-            <w:pPr>
-              <w:pStyle w:val="Compact"/>
-            </w:pPr>
-            <w:r>
-              <w:t xml:space="preserve">163</w:t>
-            </w:r>
-          </w:p>
-        </w:tc>
-        <w:tc>
-          <w:tcPr/>
-          <w:p>
-            <w:pPr>
-              <w:pStyle w:val="Compact"/>
-            </w:pPr>
-            <w:r>
-              <w:t xml:space="preserve">420</w:t>
-            </w:r>
-          </w:p>
-        </w:tc>
-        <w:tc>
-          <w:tcPr/>
-          <w:p>
-            <w:pPr>
-              <w:pStyle w:val="Compact"/>
-            </w:pPr>
-            <w:r>
-              <w:t xml:space="preserve">367</w:t>
-            </w:r>
-          </w:p>
-        </w:tc>
-        <w:tc>
-          <w:tcPr/>
-          <w:p>
-            <w:pPr>
-              <w:pStyle w:val="Compact"/>
-            </w:pPr>
-            <w:r>
-              <w:t xml:space="preserve">140</w:t>
-            </w:r>
-          </w:p>
-        </w:tc>
-        <w:tc>
-          <w:tcPr/>
-          <w:p>
-            <w:pPr>
-              <w:pStyle w:val="Compact"/>
-            </w:pPr>
-            <w:r>
-              <w:t xml:space="preserve">60</w:t>
-            </w:r>
-          </w:p>
-        </w:tc>
-        <w:tc>
-          <w:tcPr/>
-          <w:p>
-            <w:pPr>
-              <w:pStyle w:val="Compact"/>
-            </w:pPr>
-            <w:r>
-              <w:t xml:space="preserve">15</w:t>
-            </w:r>
-          </w:p>
-        </w:tc>
-      </w:tr>
     </w:tbl>
     <w:bookmarkEnd w:id="16"/>
     <w:bookmarkStart w:id="17" w:name="calibrated-parameters-and-priors"/>
@@ -6510,7 +5720,7 @@
         <w:pStyle w:val="BodyText"/>
       </w:pPr>
       <w:r>
-        <w:t xml:space="preserve">At the observed data, however, the neural posterior did not match the MCMC posterior (Table S4). Of 4,000 random neural posterior draws, 1,329 (33%) failed the equilibrium check, which the MCMC treats as impossible; they were dropped before the comparison. Its 95% intervals were on average 28% wider than the MCMC intervals, and no parameter passed all three checks. Calibration on average across prior datasets does not guarantee accuracy at one dataset; with six noisy summaries and a wide prior, the network spends its capacity over the whole prior range. The policy medians were less sensitive: they differed from the MCMC results by at most 0.3%, although the share of draws meeting both targets at 5,000 tests a year with 25% to F differed by 8 percentage points. We used the MCMC posterior for all results. The full comparison is in the project repository (</w:t>
+        <w:t xml:space="preserve">At the observed data, however, the neural posterior did not match the MCMC posterior (Table S4). Of 4,000 random neural posterior draws, 1,329 (33%) failed the equilibrium check, which the MCMC treats as impossible; they were dropped before the comparison. Its 95% intervals were on average 28% wider than the MCMC intervals, and no parameter passed all three checks. Calibration on average across prior datasets does not guarantee accuracy at one dataset; with six noisy summaries and a wide prior, the network spends its capacity over the whole prior range. The policy medians were less sensitive: they differed from the MCMC results by at most 0.3%, although the share of draws meeting both targets at 5,000 tests a year with 25% to F differed by 11 percentage points. We used the MCMC posterior for all results. The full comparison is in the project repository (</w:t>
       </w:r>
       <w:r>
         <w:rPr>
@@ -6718,18 +5928,18 @@
               <w:pStyle w:val="Compact"/>
             </w:pPr>
             <w:r>
-              <w:t xml:space="preserve">6.0%</w:t>
-            </w:r>
-          </w:p>
-        </w:tc>
-        <w:tc>
-          <w:tcPr/>
-          <w:p>
-            <w:pPr>
-              <w:pStyle w:val="Compact"/>
-            </w:pPr>
-            <w:r>
-              <w:t xml:space="preserve">8.2</w:t>
+              <w:t xml:space="preserve">5.8%</w:t>
+            </w:r>
+          </w:p>
+        </w:tc>
+        <w:tc>
+          <w:tcPr/>
+          <w:p>
+            <w:pPr>
+              <w:pStyle w:val="Compact"/>
+            </w:pPr>
+            <w:r>
+              <w:t xml:space="preserve">10.9</w:t>
             </w:r>
           </w:p>
         </w:tc>
@@ -9989,18 +9199,18 @@
               <w:pStyle w:val="Compact"/>
             </w:pPr>
             <w:r>
-              <w:t xml:space="preserve">85.7% (95% UI: 70.5%–91.3%)</w:t>
-            </w:r>
-          </w:p>
-        </w:tc>
-        <w:tc>
-          <w:tcPr/>
-          <w:p>
-            <w:pPr>
-              <w:pStyle w:val="Compact"/>
-            </w:pPr>
-            <w:r>
-              <w:t xml:space="preserve">54.9% (95% UI: 52.3%–57.4%)</w:t>
+              <w:t xml:space="preserve">84.5% (95% UI: 68.7%–90.5%)</w:t>
+            </w:r>
+          </w:p>
+        </w:tc>
+        <w:tc>
+          <w:tcPr/>
+          <w:p>
+            <w:pPr>
+              <w:pStyle w:val="Compact"/>
+            </w:pPr>
+            <w:r>
+              <w:t xml:space="preserve">54.9% (95% UI: 52.3%–57.5%)</w:t>
             </w:r>
           </w:p>
         </w:tc>
@@ -10022,18 +9232,18 @@
               <w:pStyle w:val="Compact"/>
             </w:pPr>
             <w:r>
-              <w:t xml:space="preserve">84.3% (95% UI: 66.5%–90.5%)</w:t>
-            </w:r>
-          </w:p>
-        </w:tc>
-        <w:tc>
-          <w:tcPr/>
-          <w:p>
-            <w:pPr>
-              <w:pStyle w:val="Compact"/>
-            </w:pPr>
-            <w:r>
-              <w:t xml:space="preserve">46.2% (95% UI: 43.8%–48.7%)</w:t>
+              <w:t xml:space="preserve">82.5% (95% UI: 63.6%–89.5%)</w:t>
+            </w:r>
+          </w:p>
+        </w:tc>
+        <w:tc>
+          <w:tcPr/>
+          <w:p>
+            <w:pPr>
+              <w:pStyle w:val="Compact"/>
+            </w:pPr>
+            <w:r>
+              <w:t xml:space="preserve">46.2% (95% UI: 43.8%–48.8%)</w:t>
             </w:r>
           </w:p>
         </w:tc>
@@ -10057,18 +9267,18 @@
               <w:pStyle w:val="Compact"/>
             </w:pPr>
             <w:r>
-              <w:t xml:space="preserve">86.8% (95% UI: 72.0%–92.0%)</w:t>
-            </w:r>
-          </w:p>
-        </w:tc>
-        <w:tc>
-          <w:tcPr/>
-          <w:p>
-            <w:pPr>
-              <w:pStyle w:val="Compact"/>
-            </w:pPr>
-            <w:r>
-              <w:t xml:space="preserve">56.8% (95% UI: 54.3%–59.3%)</w:t>
+              <w:t xml:space="preserve">85.6% (95% UI: 70.1%–91.3%)</w:t>
+            </w:r>
+          </w:p>
+        </w:tc>
+        <w:tc>
+          <w:tcPr/>
+          <w:p>
+            <w:pPr>
+              <w:pStyle w:val="Compact"/>
+            </w:pPr>
+            <w:r>
+              <w:t xml:space="preserve">56.8% (95% UI: 54.3%–59.4%)</w:t>
             </w:r>
           </w:p>
         </w:tc>
@@ -10090,7 +9300,7 @@
               <w:pStyle w:val="Compact"/>
             </w:pPr>
             <w:r>
-              <w:t xml:space="preserve">85.5% (95% UI: 68.1%–91.4%)</w:t>
+              <w:t xml:space="preserve">83.8% (95% UI: 65.1%–90.4%)</w:t>
             </w:r>
           </w:p>
         </w:tc>
@@ -10125,18 +9335,18 @@
               <w:pStyle w:val="Compact"/>
             </w:pPr>
             <w:r>
-              <w:t xml:space="preserve">87.5% (95% UI: 72.8%–92.5%)</w:t>
-            </w:r>
-          </w:p>
-        </w:tc>
-        <w:tc>
-          <w:tcPr/>
-          <w:p>
-            <w:pPr>
-              <w:pStyle w:val="Compact"/>
-            </w:pPr>
-            <w:r>
-              <w:t xml:space="preserve">58.1% (95% UI: 55.7%–60.5%)</w:t>
+              <w:t xml:space="preserve">86.3% (95% UI: 70.8%–91.8%)</w:t>
+            </w:r>
+          </w:p>
+        </w:tc>
+        <w:tc>
+          <w:tcPr/>
+          <w:p>
+            <w:pPr>
+              <w:pStyle w:val="Compact"/>
+            </w:pPr>
+            <w:r>
+              <w:t xml:space="preserve">58.1% (95% UI: 55.6%–60.5%)</w:t>
             </w:r>
           </w:p>
         </w:tc>
@@ -10158,18 +9368,18 @@
               <w:pStyle w:val="Compact"/>
             </w:pPr>
             <w:r>
-              <w:t xml:space="preserve">86.3% (95% UI: 68.9%–92.0%)</w:t>
-            </w:r>
-          </w:p>
-        </w:tc>
-        <w:tc>
-          <w:tcPr/>
-          <w:p>
-            <w:pPr>
-              <w:pStyle w:val="Compact"/>
-            </w:pPr>
-            <w:r>
-              <w:t xml:space="preserve">50.2% (95% UI: 47.9%–52.6%)</w:t>
+              <w:t xml:space="preserve">84.6% (95% UI: 65.9%–91.0%)</w:t>
+            </w:r>
+          </w:p>
+        </w:tc>
+        <w:tc>
+          <w:tcPr/>
+          <w:p>
+            <w:pPr>
+              <w:pStyle w:val="Compact"/>
+            </w:pPr>
+            <w:r>
+              <w:t xml:space="preserve">50.1% (95% UI: 47.8%–52.5%)</w:t>
             </w:r>
           </w:p>
         </w:tc>
@@ -10193,18 +9403,18 @@
               <w:pStyle w:val="Compact"/>
             </w:pPr>
             <w:r>
-              <w:t xml:space="preserve">89.2% (95% UI: 74.7%–93.7%)</w:t>
-            </w:r>
-          </w:p>
-        </w:tc>
-        <w:tc>
-          <w:tcPr/>
-          <w:p>
-            <w:pPr>
-              <w:pStyle w:val="Compact"/>
-            </w:pPr>
-            <w:r>
-              <w:t xml:space="preserve">61.1% (95% UI: 58.8%–63.3%)</w:t>
+              <w:t xml:space="preserve">88.0% (95% UI: 72.9%–93.0%)</w:t>
+            </w:r>
+          </w:p>
+        </w:tc>
+        <w:tc>
+          <w:tcPr/>
+          <w:p>
+            <w:pPr>
+              <w:pStyle w:val="Compact"/>
+            </w:pPr>
+            <w:r>
+              <w:t xml:space="preserve">61.0% (95% UI: 58.6%–63.3%)</w:t>
             </w:r>
           </w:p>
         </w:tc>
@@ -10226,18 +9436,18 @@
               <w:pStyle w:val="Compact"/>
             </w:pPr>
             <w:r>
-              <w:t xml:space="preserve">88.1% (95% UI: 71.2%–93.2%)</w:t>
-            </w:r>
-          </w:p>
-        </w:tc>
-        <w:tc>
-          <w:tcPr/>
-          <w:p>
-            <w:pPr>
-              <w:pStyle w:val="Compact"/>
-            </w:pPr>
-            <w:r>
-              <w:t xml:space="preserve">53.8% (95% UI: 51.6%–56.1%)</w:t>
+              <w:t xml:space="preserve">86.5% (95% UI: 68.4%–92.3%)</w:t>
+            </w:r>
+          </w:p>
+        </w:tc>
+        <w:tc>
+          <w:tcPr/>
+          <w:p>
+            <w:pPr>
+              <w:pStyle w:val="Compact"/>
+            </w:pPr>
+            <w:r>
+              <w:t xml:space="preserve">53.7% (95% UI: 51.5%–56.0%)</w:t>
             </w:r>
           </w:p>
         </w:tc>
@@ -10261,51 +9471,51 @@
               <w:pStyle w:val="Compact"/>
             </w:pPr>
             <w:r>
-              <w:t xml:space="preserve">93.2% (95% UI: 79.3%–96.4%)</w:t>
-            </w:r>
-          </w:p>
-        </w:tc>
-        <w:tc>
-          <w:tcPr/>
-          <w:p>
-            <w:pPr>
-              <w:pStyle w:val="Compact"/>
-            </w:pPr>
-            <w:r>
-              <w:t xml:space="preserve">68.5% (95% UI: 66.6%–70.4%)</w:t>
-            </w:r>
-          </w:p>
-        </w:tc>
-        <w:tc>
-          <w:tcPr/>
-          <w:p>
-            <w:pPr>
-              <w:pStyle w:val="Compact"/>
-            </w:pPr>
-            <w:r>
-              <w:t xml:space="preserve">97%</w:t>
-            </w:r>
-          </w:p>
-        </w:tc>
-        <w:tc>
-          <w:tcPr/>
-          <w:p>
-            <w:pPr>
-              <w:pStyle w:val="Compact"/>
-            </w:pPr>
-            <w:r>
-              <w:t xml:space="preserve">92.5% (95% UI: 76.2%–96.1%)</w:t>
-            </w:r>
-          </w:p>
-        </w:tc>
-        <w:tc>
-          <w:tcPr/>
-          <w:p>
-            <w:pPr>
-              <w:pStyle w:val="Compact"/>
-            </w:pPr>
-            <w:r>
-              <w:t xml:space="preserve">63.0% (95% UI: 61.0%–64.9%)</w:t>
+              <w:t xml:space="preserve">92.0% (95% UI: 77.4%–95.8%)</w:t>
+            </w:r>
+          </w:p>
+        </w:tc>
+        <w:tc>
+          <w:tcPr/>
+          <w:p>
+            <w:pPr>
+              <w:pStyle w:val="Compact"/>
+            </w:pPr>
+            <w:r>
+              <w:t xml:space="preserve">68.4% (95% UI: 66.3%–70.2%)</w:t>
+            </w:r>
+          </w:p>
+        </w:tc>
+        <w:tc>
+          <w:tcPr/>
+          <w:p>
+            <w:pPr>
+              <w:pStyle w:val="Compact"/>
+            </w:pPr>
+            <w:r>
+              <w:t xml:space="preserve">95%</w:t>
+            </w:r>
+          </w:p>
+        </w:tc>
+        <w:tc>
+          <w:tcPr/>
+          <w:p>
+            <w:pPr>
+              <w:pStyle w:val="Compact"/>
+            </w:pPr>
+            <w:r>
+              <w:t xml:space="preserve">91.0% (95% UI: 73.4%–95.4%)</w:t>
+            </w:r>
+          </w:p>
+        </w:tc>
+        <w:tc>
+          <w:tcPr/>
+          <w:p>
+            <w:pPr>
+              <w:pStyle w:val="Compact"/>
+            </w:pPr>
+            <w:r>
+              <w:t xml:space="preserve">62.7% (95% UI: 60.7%–64.7%)</w:t>
             </w:r>
           </w:p>
         </w:tc>
@@ -10329,18 +9539,18 @@
               <w:pStyle w:val="Compact"/>
             </w:pPr>
             <w:r>
-              <w:t xml:space="preserve">95.7% (95% UI: 81.9%–98.1%)</w:t>
-            </w:r>
-          </w:p>
-        </w:tc>
-        <w:tc>
-          <w:tcPr/>
-          <w:p>
-            <w:pPr>
-              <w:pStyle w:val="Compact"/>
-            </w:pPr>
-            <w:r>
-              <w:t xml:space="preserve">74.1% (95% UI: 72.4%–75.7%)</w:t>
+              <w:t xml:space="preserve">94.9% (95% UI: 80.1%–97.6%)</w:t>
+            </w:r>
+          </w:p>
+        </w:tc>
+        <w:tc>
+          <w:tcPr/>
+          <w:p>
+            <w:pPr>
+              <w:pStyle w:val="Compact"/>
+            </w:pPr>
+            <w:r>
+              <w:t xml:space="preserve">73.9% (95% UI: 72.2%–75.5%)</w:t>
             </w:r>
           </w:p>
         </w:tc>
@@ -10362,18 +9572,18 @@
               <w:pStyle w:val="Compact"/>
             </w:pPr>
             <w:r>
-              <w:t xml:space="preserve">95.3% (95% UI: 79.3%–98.0%)</w:t>
-            </w:r>
-          </w:p>
-        </w:tc>
-        <w:tc>
-          <w:tcPr/>
-          <w:p>
-            <w:pPr>
-              <w:pStyle w:val="Compact"/>
-            </w:pPr>
-            <w:r>
-              <w:t xml:space="preserve">69.8% (95% UI: 68.1%–71.5%)</w:t>
+              <w:t xml:space="preserve">94.2% (95% UI: 76.6%–97.4%)</w:t>
+            </w:r>
+          </w:p>
+        </w:tc>
+        <w:tc>
+          <w:tcPr/>
+          <w:p>
+            <w:pPr>
+              <w:pStyle w:val="Compact"/>
+            </w:pPr>
+            <w:r>
+              <w:t xml:space="preserve">69.5% (95% UI: 67.8%–71.3%)</w:t>
             </w:r>
           </w:p>
         </w:tc>
@@ -10397,7 +9607,7 @@
               <w:pStyle w:val="Compact"/>
             </w:pPr>
             <w:r>
-              <w:t xml:space="preserve">87.9% (95% UI: 73.2%–92.8%)</w:t>
+              <w:t xml:space="preserve">86.7% (95% UI: 71.4%–92.0%)</w:t>
             </w:r>
           </w:p>
         </w:tc>
@@ -10430,7 +9640,7 @@
               <w:pStyle w:val="Compact"/>
             </w:pPr>
             <w:r>
-              <w:t xml:space="preserve">86.7% (95% UI: 69.5%–92.2%)</w:t>
+              <w:t xml:space="preserve">85.0% (95% UI: 66.6%–91.2%)</w:t>
             </w:r>
           </w:p>
         </w:tc>
@@ -10465,18 +9675,18 @@
               <w:pStyle w:val="Compact"/>
             </w:pPr>
             <w:r>
-              <w:t xml:space="preserve">89.2% (95% UI: 74.7%–93.7%)</w:t>
-            </w:r>
-          </w:p>
-        </w:tc>
-        <w:tc>
-          <w:tcPr/>
-          <w:p>
-            <w:pPr>
-              <w:pStyle w:val="Compact"/>
-            </w:pPr>
-            <w:r>
-              <w:t xml:space="preserve">57.3% (95% UI: 54.8%–59.8%)</w:t>
+              <w:t xml:space="preserve">88.0% (95% UI: 72.9%–93.0%)</w:t>
+            </w:r>
+          </w:p>
+        </w:tc>
+        <w:tc>
+          <w:tcPr/>
+          <w:p>
+            <w:pPr>
+              <w:pStyle w:val="Compact"/>
+            </w:pPr>
+            <w:r>
+              <w:t xml:space="preserve">57.3% (95% UI: 54.7%–59.8%)</w:t>
             </w:r>
           </w:p>
         </w:tc>
@@ -10498,18 +9708,18 @@
               <w:pStyle w:val="Compact"/>
             </w:pPr>
             <w:r>
-              <w:t xml:space="preserve">88.1% (95% UI: 71.2%–93.2%)</w:t>
-            </w:r>
-          </w:p>
-        </w:tc>
-        <w:tc>
-          <w:tcPr/>
-          <w:p>
-            <w:pPr>
-              <w:pStyle w:val="Compact"/>
-            </w:pPr>
-            <w:r>
-              <w:t xml:space="preserve">49.2% (95% UI: 46.8%–51.7%)</w:t>
+              <w:t xml:space="preserve">86.5% (95% UI: 68.4%–92.3%)</w:t>
+            </w:r>
+          </w:p>
+        </w:tc>
+        <w:tc>
+          <w:tcPr/>
+          <w:p>
+            <w:pPr>
+              <w:pStyle w:val="Compact"/>
+            </w:pPr>
+            <w:r>
+              <w:t xml:space="preserve">49.1% (95% UI: 46.7%–51.6%)</w:t>
             </w:r>
           </w:p>
         </w:tc>
@@ -10533,18 +9743,18 @@
               <w:pStyle w:val="Compact"/>
             </w:pPr>
             <w:r>
-              <w:t xml:space="preserve">92.0% (95% UI: 78.0%–95.7%)</w:t>
-            </w:r>
-          </w:p>
-        </w:tc>
-        <w:tc>
-          <w:tcPr/>
-          <w:p>
-            <w:pPr>
-              <w:pStyle w:val="Compact"/>
-            </w:pPr>
-            <w:r>
-              <w:t xml:space="preserve">59.6% (95% UI: 57.1%–62.0%)</w:t>
+              <w:t xml:space="preserve">90.9% (95% UI: 75.7%–94.9%)</w:t>
+            </w:r>
+          </w:p>
+        </w:tc>
+        <w:tc>
+          <w:tcPr/>
+          <w:p>
+            <w:pPr>
+              <w:pStyle w:val="Compact"/>
+            </w:pPr>
+            <w:r>
+              <w:t xml:space="preserve">59.5% (95% UI: 57.0%–62.0%)</w:t>
             </w:r>
           </w:p>
         </w:tc>
@@ -10566,18 +9776,18 @@
               <w:pStyle w:val="Compact"/>
             </w:pPr>
             <w:r>
-              <w:t xml:space="preserve">91.2% (95% UI: 74.8%–95.3%)</w:t>
-            </w:r>
-          </w:p>
-        </w:tc>
-        <w:tc>
-          <w:tcPr/>
-          <w:p>
-            <w:pPr>
-              <w:pStyle w:val="Compact"/>
-            </w:pPr>
-            <w:r>
-              <w:t xml:space="preserve">51.9% (95% UI: 49.5%–54.3%)</w:t>
+              <w:t xml:space="preserve">89.7% (95% UI: 71.8%–94.5%)</w:t>
+            </w:r>
+          </w:p>
+        </w:tc>
+        <w:tc>
+          <w:tcPr/>
+          <w:p>
+            <w:pPr>
+              <w:pStyle w:val="Compact"/>
+            </w:pPr>
+            <w:r>
+              <w:t xml:space="preserve">51.8% (95% UI: 49.4%–54.2%)</w:t>
             </w:r>
           </w:p>
         </w:tc>
@@ -10601,51 +9811,51 @@
               <w:pStyle w:val="Compact"/>
             </w:pPr>
             <w:r>
-              <w:t xml:space="preserve">96.9% (95% UI: 83.2%–98.8%)</w:t>
-            </w:r>
-          </w:p>
-        </w:tc>
-        <w:tc>
-          <w:tcPr/>
-          <w:p>
-            <w:pPr>
-              <w:pStyle w:val="Compact"/>
-            </w:pPr>
-            <w:r>
-              <w:t xml:space="preserve">65.2% (95% UI: 63.0%–67.4%)</w:t>
-            </w:r>
-          </w:p>
-        </w:tc>
-        <w:tc>
-          <w:tcPr/>
-          <w:p>
-            <w:pPr>
-              <w:pStyle w:val="Compact"/>
-            </w:pPr>
-            <w:r>
-              <w:t xml:space="preserve">57%</w:t>
-            </w:r>
-          </w:p>
-        </w:tc>
-        <w:tc>
-          <w:tcPr/>
-          <w:p>
-            <w:pPr>
-              <w:pStyle w:val="Compact"/>
-            </w:pPr>
-            <w:r>
-              <w:t xml:space="preserve">96.5% (95% UI: 81.1%–98.7%)</w:t>
-            </w:r>
-          </w:p>
-        </w:tc>
-        <w:tc>
-          <w:tcPr/>
-          <w:p>
-            <w:pPr>
-              <w:pStyle w:val="Compact"/>
-            </w:pPr>
-            <w:r>
-              <w:t xml:space="preserve">58.8% (95% UI: 56.6%–61.1%)</w:t>
+              <w:t xml:space="preserve">96.1% (95% UI: 81.5%–98.4%)</w:t>
+            </w:r>
+          </w:p>
+        </w:tc>
+        <w:tc>
+          <w:tcPr/>
+          <w:p>
+            <w:pPr>
+              <w:pStyle w:val="Compact"/>
+            </w:pPr>
+            <w:r>
+              <w:t xml:space="preserve">65.1% (95% UI: 62.8%–67.3%)</w:t>
+            </w:r>
+          </w:p>
+        </w:tc>
+        <w:tc>
+          <w:tcPr/>
+          <w:p>
+            <w:pPr>
+              <w:pStyle w:val="Compact"/>
+            </w:pPr>
+            <w:r>
+              <w:t xml:space="preserve">51%</w:t>
+            </w:r>
+          </w:p>
+        </w:tc>
+        <w:tc>
+          <w:tcPr/>
+          <w:p>
+            <w:pPr>
+              <w:pStyle w:val="Compact"/>
+            </w:pPr>
+            <w:r>
+              <w:t xml:space="preserve">95.6% (95% UI: 78.3%–98.2%)</w:t>
+            </w:r>
+          </w:p>
+        </w:tc>
+        <w:tc>
+          <w:tcPr/>
+          <w:p>
+            <w:pPr>
+              <w:pStyle w:val="Compact"/>
+            </w:pPr>
+            <w:r>
+              <w:t xml:space="preserve">58.6% (95% UI: 56.4%–60.9%)</w:t>
             </w:r>
           </w:p>
         </w:tc>
@@ -10669,51 +9879,51 @@
               <w:pStyle w:val="Compact"/>
             </w:pPr>
             <w:r>
-              <w:t xml:space="preserve">98.6% (95% UI: 85.6%–99.8%)</w:t>
-            </w:r>
-          </w:p>
-        </w:tc>
-        <w:tc>
-          <w:tcPr/>
-          <w:p>
-            <w:pPr>
-              <w:pStyle w:val="Compact"/>
-            </w:pPr>
-            <w:r>
-              <w:t xml:space="preserve">69.7% (95% UI: 67.7%–71.7%)</w:t>
-            </w:r>
-          </w:p>
-        </w:tc>
-        <w:tc>
-          <w:tcPr/>
-          <w:p>
-            <w:pPr>
-              <w:pStyle w:val="Compact"/>
-            </w:pPr>
-            <w:r>
-              <w:t xml:space="preserve">100%</w:t>
-            </w:r>
-          </w:p>
-        </w:tc>
-        <w:tc>
-          <w:tcPr/>
-          <w:p>
-            <w:pPr>
-              <w:pStyle w:val="Compact"/>
-            </w:pPr>
-            <w:r>
-              <w:t xml:space="preserve">98.5% (95% UI: 83.4%–99.8%)</w:t>
-            </w:r>
-          </w:p>
-        </w:tc>
-        <w:tc>
-          <w:tcPr/>
-          <w:p>
-            <w:pPr>
-              <w:pStyle w:val="Compact"/>
-            </w:pPr>
-            <w:r>
-              <w:t xml:space="preserve">64.3% (95% UI: 62.3%–66.4%)</w:t>
+              <w:t xml:space="preserve">98.3% (95% UI: 84.1%–99.6%)</w:t>
+            </w:r>
+          </w:p>
+        </w:tc>
+        <w:tc>
+          <w:tcPr/>
+          <w:p>
+            <w:pPr>
+              <w:pStyle w:val="Compact"/>
+            </w:pPr>
+            <w:r>
+              <w:t xml:space="preserve">69.6% (95% UI: 67.5%–71.6%)</w:t>
+            </w:r>
+          </w:p>
+        </w:tc>
+        <w:tc>
+          <w:tcPr/>
+          <w:p>
+            <w:pPr>
+              <w:pStyle w:val="Compact"/>
+            </w:pPr>
+            <w:r>
+              <w:t xml:space="preserve">99%</w:t>
+            </w:r>
+          </w:p>
+        </w:tc>
+        <w:tc>
+          <w:tcPr/>
+          <w:p>
+            <w:pPr>
+              <w:pStyle w:val="Compact"/>
+            </w:pPr>
+            <w:r>
+              <w:t xml:space="preserve">98.0% (95% UI: 81.4%–99.6%)</w:t>
+            </w:r>
+          </w:p>
+        </w:tc>
+        <w:tc>
+          <w:tcPr/>
+          <w:p>
+            <w:pPr>
+              <w:pStyle w:val="Compact"/>
+            </w:pPr>
+            <w:r>
+              <w:t xml:space="preserve">64.1% (95% UI: 62.0%–66.2%)</w:t>
             </w:r>
           </w:p>
         </w:tc>
@@ -10737,18 +9947,18 @@
               <w:pStyle w:val="Compact"/>
             </w:pPr>
             <w:r>
-              <w:t xml:space="preserve">88.9% (95% UI: 74.2%–93.5%)</w:t>
-            </w:r>
-          </w:p>
-        </w:tc>
-        <w:tc>
-          <w:tcPr/>
-          <w:p>
-            <w:pPr>
-              <w:pStyle w:val="Compact"/>
-            </w:pPr>
-            <w:r>
-              <w:t xml:space="preserve">55.9% (95% UI: 53.3%–58.4%)</w:t>
+              <w:t xml:space="preserve">87.7% (95% UI: 72.6%–92.7%)</w:t>
+            </w:r>
+          </w:p>
+        </w:tc>
+        <w:tc>
+          <w:tcPr/>
+          <w:p>
+            <w:pPr>
+              <w:pStyle w:val="Compact"/>
+            </w:pPr>
+            <w:r>
+              <w:t xml:space="preserve">55.9% (95% UI: 53.2%–58.5%)</w:t>
             </w:r>
           </w:p>
         </w:tc>
@@ -10770,7 +9980,7 @@
               <w:pStyle w:val="Compact"/>
             </w:pPr>
             <w:r>
-              <w:t xml:space="preserve">87.8% (95% UI: 70.7%–93.0%)</w:t>
+              <w:t xml:space="preserve">86.1% (95% UI: 67.9%–92.0%)</w:t>
             </w:r>
           </w:p>
         </w:tc>
@@ -10805,18 +10015,18 @@
               <w:pStyle w:val="Compact"/>
             </w:pPr>
             <w:r>
-              <w:t xml:space="preserve">90.7% (95% UI: 76.7%–94.8%)</w:t>
-            </w:r>
-          </w:p>
-        </w:tc>
-        <w:tc>
-          <w:tcPr/>
-          <w:p>
-            <w:pPr>
-              <w:pStyle w:val="Compact"/>
-            </w:pPr>
-            <w:r>
-              <w:t xml:space="preserve">56.5% (95% UI: 53.9%–59.1%)</w:t>
+              <w:t xml:space="preserve">89.5% (95% UI: 74.7%–94.0%)</w:t>
+            </w:r>
+          </w:p>
+        </w:tc>
+        <w:tc>
+          <w:tcPr/>
+          <w:p>
+            <w:pPr>
+              <w:pStyle w:val="Compact"/>
+            </w:pPr>
+            <w:r>
+              <w:t xml:space="preserve">56.4% (95% UI: 53.8%–59.1%)</w:t>
             </w:r>
           </w:p>
         </w:tc>
@@ -10838,18 +10048,18 @@
               <w:pStyle w:val="Compact"/>
             </w:pPr>
             <w:r>
-              <w:t xml:space="preserve">89.8% (95% UI: 73.4%–94.4%)</w:t>
-            </w:r>
-          </w:p>
-        </w:tc>
-        <w:tc>
-          <w:tcPr/>
-          <w:p>
-            <w:pPr>
-              <w:pStyle w:val="Compact"/>
-            </w:pPr>
-            <w:r>
-              <w:t xml:space="preserve">48.1% (95% UI: 45.6%–50.7%)</w:t>
+              <w:t xml:space="preserve">88.2% (95% UI: 70.4%–93.4%)</w:t>
+            </w:r>
+          </w:p>
+        </w:tc>
+        <w:tc>
+          <w:tcPr/>
+          <w:p>
+            <w:pPr>
+              <w:pStyle w:val="Compact"/>
+            </w:pPr>
+            <w:r>
+              <w:t xml:space="preserve">48.1% (95% UI: 45.6%–50.6%)</w:t>
             </w:r>
           </w:p>
         </w:tc>
@@ -10873,18 +10083,18 @@
               <w:pStyle w:val="Compact"/>
             </w:pPr>
             <w:r>
-              <w:t xml:space="preserve">94.2% (95% UI: 80.2%–97.1%)</w:t>
-            </w:r>
-          </w:p>
-        </w:tc>
-        <w:tc>
-          <w:tcPr/>
-          <w:p>
-            <w:pPr>
-              <w:pStyle w:val="Compact"/>
-            </w:pPr>
-            <w:r>
-              <w:t xml:space="preserve">57.8% (95% UI: 55.2%–60.5%)</w:t>
+              <w:t xml:space="preserve">93.1% (95% UI: 78.4%–96.5%)</w:t>
+            </w:r>
+          </w:p>
+        </w:tc>
+        <w:tc>
+          <w:tcPr/>
+          <w:p>
+            <w:pPr>
+              <w:pStyle w:val="Compact"/>
+            </w:pPr>
+            <w:r>
+              <w:t xml:space="preserve">57.8% (95% UI: 55.1%–60.4%)</w:t>
             </w:r>
           </w:p>
         </w:tc>
@@ -10906,18 +10116,18 @@
               <w:pStyle w:val="Compact"/>
             </w:pPr>
             <w:r>
-              <w:t xml:space="preserve">93.6% (95% UI: 77.3%–96.9%)</w:t>
-            </w:r>
-          </w:p>
-        </w:tc>
-        <w:tc>
-          <w:tcPr/>
-          <w:p>
-            <w:pPr>
-              <w:pStyle w:val="Compact"/>
-            </w:pPr>
-            <w:r>
-              <w:t xml:space="preserve">49.7% (95% UI: 47.2%–52.3%)</w:t>
+              <w:t xml:space="preserve">92.2% (95% UI: 74.6%–96.1%)</w:t>
+            </w:r>
+          </w:p>
+        </w:tc>
+        <w:tc>
+          <w:tcPr/>
+          <w:p>
+            <w:pPr>
+              <w:pStyle w:val="Compact"/>
+            </w:pPr>
+            <w:r>
+              <w:t xml:space="preserve">49.6% (95% UI: 47.1%–52.2%)</w:t>
             </w:r>
           </w:p>
         </w:tc>
@@ -10941,18 +10151,18 @@
               <w:pStyle w:val="Compact"/>
             </w:pPr>
             <w:r>
-              <w:t xml:space="preserve">98.5% (95% UI: 85.3%–99.7%)</w:t>
-            </w:r>
-          </w:p>
-        </w:tc>
-        <w:tc>
-          <w:tcPr/>
-          <w:p>
-            <w:pPr>
-              <w:pStyle w:val="Compact"/>
-            </w:pPr>
-            <w:r>
-              <w:t xml:space="preserve">61.1% (95% UI: 58.5%–63.7%)</w:t>
+              <w:t xml:space="preserve">98.1% (95% UI: 83.8%–99.5%)</w:t>
+            </w:r>
+          </w:p>
+        </w:tc>
+        <w:tc>
+          <w:tcPr/>
+          <w:p>
+            <w:pPr>
+              <w:pStyle w:val="Compact"/>
+            </w:pPr>
+            <w:r>
+              <w:t xml:space="preserve">61.0% (95% UI: 58.4%–63.6%)</w:t>
             </w:r>
           </w:p>
         </w:tc>
@@ -10974,18 +10184,18 @@
               <w:pStyle w:val="Compact"/>
             </w:pPr>
             <w:r>
-              <w:t xml:space="preserve">98.3% (95% UI: 83.1%–99.7%)</w:t>
-            </w:r>
-          </w:p>
-        </w:tc>
-        <w:tc>
-          <w:tcPr/>
-          <w:p>
-            <w:pPr>
-              <w:pStyle w:val="Compact"/>
-            </w:pPr>
-            <w:r>
-              <w:t xml:space="preserve">53.7% (95% UI: 51.2%–56.2%)</w:t>
+              <w:t xml:space="preserve">97.8% (95% UI: 80.9%–99.5%)</w:t>
+            </w:r>
+          </w:p>
+        </w:tc>
+        <w:tc>
+          <w:tcPr/>
+          <w:p>
+            <w:pPr>
+              <w:pStyle w:val="Compact"/>
+            </w:pPr>
+            <w:r>
+              <w:t xml:space="preserve">53.5% (95% UI: 51.1%–56.1%)</w:t>
             </w:r>
           </w:p>
         </w:tc>
@@ -11009,51 +10219,51 @@
               <w:pStyle w:val="Compact"/>
             </w:pPr>
             <w:r>
-              <w:t xml:space="preserve">99.1% (95% UI: 86.7%–100.0%)</w:t>
-            </w:r>
-          </w:p>
-        </w:tc>
-        <w:tc>
-          <w:tcPr/>
-          <w:p>
-            <w:pPr>
-              <w:pStyle w:val="Compact"/>
-            </w:pPr>
-            <w:r>
-              <w:t xml:space="preserve">63.8% (95% UI: 61.4%–66.2%)</w:t>
-            </w:r>
-          </w:p>
-        </w:tc>
-        <w:tc>
-          <w:tcPr/>
-          <w:p>
-            <w:pPr>
-              <w:pStyle w:val="Compact"/>
-            </w:pPr>
-            <w:r>
-              <w:t xml:space="preserve">17%</w:t>
-            </w:r>
-          </w:p>
-        </w:tc>
-        <w:tc>
-          <w:tcPr/>
-          <w:p>
-            <w:pPr>
-              <w:pStyle w:val="Compact"/>
-            </w:pPr>
-            <w:r>
-              <w:t xml:space="preserve">99.0% (95% UI: 84.7%–100.0%)</w:t>
-            </w:r>
-          </w:p>
-        </w:tc>
-        <w:tc>
-          <w:tcPr/>
-          <w:p>
-            <w:pPr>
-              <w:pStyle w:val="Compact"/>
-            </w:pPr>
-            <w:r>
-              <w:t xml:space="preserve">56.9% (95% UI: 54.6%–59.5%)</w:t>
+              <w:t xml:space="preserve">99.0% (95% UI: 85.8%–100.0%)</w:t>
+            </w:r>
+          </w:p>
+        </w:tc>
+        <w:tc>
+          <w:tcPr/>
+          <w:p>
+            <w:pPr>
+              <w:pStyle w:val="Compact"/>
+            </w:pPr>
+            <w:r>
+              <w:t xml:space="preserve">63.7% (95% UI: 61.2%–66.2%)</w:t>
+            </w:r>
+          </w:p>
+        </w:tc>
+        <w:tc>
+          <w:tcPr/>
+          <w:p>
+            <w:pPr>
+              <w:pStyle w:val="Compact"/>
+            </w:pPr>
+            <w:r>
+              <w:t xml:space="preserve">15%</w:t>
+            </w:r>
+          </w:p>
+        </w:tc>
+        <w:tc>
+          <w:tcPr/>
+          <w:p>
+            <w:pPr>
+              <w:pStyle w:val="Compact"/>
+            </w:pPr>
+            <w:r>
+              <w:t xml:space="preserve">98.9% (95% UI: 83.2%–100.0%)</w:t>
+            </w:r>
+          </w:p>
+        </w:tc>
+        <w:tc>
+          <w:tcPr/>
+          <w:p>
+            <w:pPr>
+              <w:pStyle w:val="Compact"/>
+            </w:pPr>
+            <w:r>
+              <w:t xml:space="preserve">56.8% (95% UI: 54.5%–59.3%)</w:t>
             </w:r>
           </w:p>
         </w:tc>
@@ -11077,18 +10287,18 @@
               <w:pStyle w:val="Compact"/>
             </w:pPr>
             <w:r>
-              <w:t xml:space="preserve">99.1% (95% UI: 86.7%–100.0%)</w:t>
-            </w:r>
-          </w:p>
-        </w:tc>
-        <w:tc>
-          <w:tcPr/>
-          <w:p>
-            <w:pPr>
-              <w:pStyle w:val="Compact"/>
-            </w:pPr>
-            <w:r>
-              <w:t xml:space="preserve">87.1% (95% UI: 85.7%–88.0%)</w:t>
+              <w:t xml:space="preserve">99.0% (95% UI: 85.8%–100.0%)</w:t>
+            </w:r>
+          </w:p>
+        </w:tc>
+        <w:tc>
+          <w:tcPr/>
+          <w:p>
+            <w:pPr>
+              <w:pStyle w:val="Compact"/>
+            </w:pPr>
+            <w:r>
+              <w:t xml:space="preserve">87.1% (95% UI: 85.8%–88.0%)</w:t>
             </w:r>
           </w:p>
         </w:tc>
@@ -11110,7 +10320,7 @@
               <w:pStyle w:val="Compact"/>
             </w:pPr>
             <w:r>
-              <w:t xml:space="preserve">99.0% (95% UI: 84.7%–100.0%)</w:t>
+              <w:t xml:space="preserve">98.9% (95% UI: 83.2%–100.0%)</w:t>
             </w:r>
           </w:p>
         </w:tc>
@@ -11417,18 +10627,18 @@
               <w:pStyle w:val="Compact"/>
             </w:pPr>
             <w:r>
-              <w:t xml:space="preserve">721 (95% UI: 539–1,085)</w:t>
-            </w:r>
-          </w:p>
-        </w:tc>
-        <w:tc>
-          <w:tcPr/>
-          <w:p>
-            <w:pPr>
-              <w:pStyle w:val="Compact"/>
-            </w:pPr>
-            <w:r>
-              <w:t xml:space="preserve">S$29.3 million (95% UI: S$22.2 million–S$43.4 million)</w:t>
+              <w:t xml:space="preserve">743 (95% UI: 554–1,117)</w:t>
+            </w:r>
+          </w:p>
+        </w:tc>
+        <w:tc>
+          <w:tcPr/>
+          <w:p>
+            <w:pPr>
+              <w:pStyle w:val="Compact"/>
+            </w:pPr>
+            <w:r>
+              <w:t xml:space="preserve">S$30.3 million (95% UI: S$22.9 million–S$44.7 million)</w:t>
             </w:r>
           </w:p>
         </w:tc>
@@ -11474,51 +10684,51 @@
               <w:pStyle w:val="Compact"/>
             </w:pPr>
             <w:r>
-              <w:t xml:space="preserve">690 (95% UI: 594–795)</w:t>
-            </w:r>
-          </w:p>
-        </w:tc>
-        <w:tc>
-          <w:tcPr/>
-          <w:p>
-            <w:pPr>
-              <w:pStyle w:val="Compact"/>
-            </w:pPr>
-            <w:r>
-              <w:t xml:space="preserve">213 (95% UI: 178–252)</w:t>
-            </w:r>
-          </w:p>
-        </w:tc>
-        <w:tc>
-          <w:tcPr/>
-          <w:p>
-            <w:pPr>
-              <w:pStyle w:val="Compact"/>
-            </w:pPr>
-            <w:r>
-              <w:t xml:space="preserve">689 (95% UI: 514–1,053)</w:t>
-            </w:r>
-          </w:p>
-        </w:tc>
-        <w:tc>
-          <w:tcPr/>
-          <w:p>
-            <w:pPr>
-              <w:pStyle w:val="Compact"/>
-            </w:pPr>
-            <w:r>
-              <w:t xml:space="preserve">S$36.7 million (95% UI: S$28.9 million–S$51.2 million)</w:t>
-            </w:r>
-          </w:p>
-        </w:tc>
-        <w:tc>
-          <w:tcPr/>
-          <w:p>
-            <w:pPr>
-              <w:pStyle w:val="Compact"/>
-            </w:pPr>
-            <w:r>
-              <w:t xml:space="preserve">S$7.3 million (95% UI: S$6.0 million–S$8.7 million)</w:t>
+              <w:t xml:space="preserve">665 (95% UI: 571–770)</w:t>
+            </w:r>
+          </w:p>
+        </w:tc>
+        <w:tc>
+          <w:tcPr/>
+          <w:p>
+            <w:pPr>
+              <w:pStyle w:val="Compact"/>
+            </w:pPr>
+            <w:r>
+              <w:t xml:space="preserve">208 (95% UI: 174–247)</w:t>
+            </w:r>
+          </w:p>
+        </w:tc>
+        <w:tc>
+          <w:tcPr/>
+          <w:p>
+            <w:pPr>
+              <w:pStyle w:val="Compact"/>
+            </w:pPr>
+            <w:r>
+              <w:t xml:space="preserve">713 (95% UI: 531–1,085)</w:t>
+            </w:r>
+          </w:p>
+        </w:tc>
+        <w:tc>
+          <w:tcPr/>
+          <w:p>
+            <w:pPr>
+              <w:pStyle w:val="Compact"/>
+            </w:pPr>
+            <w:r>
+              <w:t xml:space="preserve">S$37.5 million (95% UI: S$29.5 million–S$52.4 million)</w:t>
+            </w:r>
+          </w:p>
+        </w:tc>
+        <w:tc>
+          <w:tcPr/>
+          <w:p>
+            <w:pPr>
+              <w:pStyle w:val="Compact"/>
+            </w:pPr>
+            <w:r>
+              <w:t xml:space="preserve">S$7.1 million (95% UI: S$5.9 million–S$8.5 million)</w:t>
             </w:r>
           </w:p>
         </w:tc>
@@ -11553,51 +10763,51 @@
               <w:pStyle w:val="Compact"/>
             </w:pPr>
             <w:r>
-              <w:t xml:space="preserve">1,150 (95% UI: 990–1,324)</w:t>
-            </w:r>
-          </w:p>
-        </w:tc>
-        <w:tc>
-          <w:tcPr/>
-          <w:p>
-            <w:pPr>
-              <w:pStyle w:val="Compact"/>
-            </w:pPr>
-            <w:r>
-              <w:t xml:space="preserve">349 (95% UI: 292–413)</w:t>
-            </w:r>
-          </w:p>
-        </w:tc>
-        <w:tc>
-          <w:tcPr/>
-          <w:p>
-            <w:pPr>
-              <w:pStyle w:val="Compact"/>
-            </w:pPr>
-            <w:r>
-              <w:t xml:space="preserve">668 (95% UI: 498–1,028)</w:t>
-            </w:r>
-          </w:p>
-        </w:tc>
-        <w:tc>
-          <w:tcPr/>
-          <w:p>
-            <w:pPr>
-              <w:pStyle w:val="Compact"/>
-            </w:pPr>
-            <w:r>
-              <w:t xml:space="preserve">S$41.4 million (95% UI: S$33.1 million–S$56.2 million)</w:t>
-            </w:r>
-          </w:p>
-        </w:tc>
-        <w:tc>
-          <w:tcPr/>
-          <w:p>
-            <w:pPr>
-              <w:pStyle w:val="Compact"/>
-            </w:pPr>
-            <w:r>
-              <w:t xml:space="preserve">S$11.9 million (95% UI: S$9.9 million–S$14.3 million)</w:t>
+              <w:t xml:space="preserve">1,108 (95% UI: 952–1,284)</w:t>
+            </w:r>
+          </w:p>
+        </w:tc>
+        <w:tc>
+          <w:tcPr/>
+          <w:p>
+            <w:pPr>
+              <w:pStyle w:val="Compact"/>
+            </w:pPr>
+            <w:r>
+              <w:t xml:space="preserve">341 (95% UI: 285–405)</w:t>
+            </w:r>
+          </w:p>
+        </w:tc>
+        <w:tc>
+          <w:tcPr/>
+          <w:p>
+            <w:pPr>
+              <w:pStyle w:val="Compact"/>
+            </w:pPr>
+            <w:r>
+              <w:t xml:space="preserve">694 (95% UI: 517–1,062)</w:t>
+            </w:r>
+          </w:p>
+        </w:tc>
+        <w:tc>
+          <w:tcPr/>
+          <w:p>
+            <w:pPr>
+              <w:pStyle w:val="Compact"/>
+            </w:pPr>
+            <w:r>
+              <w:t xml:space="preserve">S$42.1 million (95% UI: S$33.5 million–S$57.2 million)</w:t>
+            </w:r>
+          </w:p>
+        </w:tc>
+        <w:tc>
+          <w:tcPr/>
+          <w:p>
+            <w:pPr>
+              <w:pStyle w:val="Compact"/>
+            </w:pPr>
+            <w:r>
+              <w:t xml:space="preserve">S$11.7 million (95% UI: S$9.8 million–S$14.0 million)</w:t>
             </w:r>
           </w:p>
         </w:tc>
@@ -11632,51 +10842,51 @@
               <w:pStyle w:val="Compact"/>
             </w:pPr>
             <w:r>
-              <w:t xml:space="preserve">2,299 (95% UI: 1,978–2,648)</w:t>
-            </w:r>
-          </w:p>
-        </w:tc>
-        <w:tc>
-          <w:tcPr/>
-          <w:p>
-            <w:pPr>
-              <w:pStyle w:val="Compact"/>
-            </w:pPr>
-            <w:r>
-              <w:t xml:space="preserve">669 (95% UI: 560–792)</w:t>
-            </w:r>
-          </w:p>
-        </w:tc>
-        <w:tc>
-          <w:tcPr/>
-          <w:p>
-            <w:pPr>
-              <w:pStyle w:val="Compact"/>
-            </w:pPr>
-            <w:r>
-              <w:t xml:space="preserve">620 (95% UI: 460–969)</w:t>
-            </w:r>
-          </w:p>
-        </w:tc>
-        <w:tc>
-          <w:tcPr/>
-          <w:p>
-            <w:pPr>
-              <w:pStyle w:val="Compact"/>
-            </w:pPr>
-            <w:r>
-              <w:t xml:space="preserve">S$52.5 million (95% UI: S$42.8 million–S$67.4 million)</w:t>
-            </w:r>
-          </w:p>
-        </w:tc>
-        <w:tc>
-          <w:tcPr/>
-          <w:p>
-            <w:pPr>
-              <w:pStyle w:val="Compact"/>
-            </w:pPr>
-            <w:r>
-              <w:t xml:space="preserve">S$22.9 million (95% UI: S$19.1 million–S$27.4 million)</w:t>
+              <w:t xml:space="preserve">2,215 (95% UI: 1,903–2,568)</w:t>
+            </w:r>
+          </w:p>
+        </w:tc>
+        <w:tc>
+          <w:tcPr/>
+          <w:p>
+            <w:pPr>
+              <w:pStyle w:val="Compact"/>
+            </w:pPr>
+            <w:r>
+              <w:t xml:space="preserve">655 (95% UI: 547–776)</w:t>
+            </w:r>
+          </w:p>
+        </w:tc>
+        <w:tc>
+          <w:tcPr/>
+          <w:p>
+            <w:pPr>
+              <w:pStyle w:val="Compact"/>
+            </w:pPr>
+            <w:r>
+              <w:t xml:space="preserve">647 (95% UI: 478–1,010)</w:t>
+            </w:r>
+          </w:p>
+        </w:tc>
+        <w:tc>
+          <w:tcPr/>
+          <w:p>
+            <w:pPr>
+              <w:pStyle w:val="Compact"/>
+            </w:pPr>
+            <w:r>
+              <w:t xml:space="preserve">S$53.2 million (95% UI: S$43.0 million–S$68.6 million)</w:t>
+            </w:r>
+          </w:p>
+        </w:tc>
+        <w:tc>
+          <w:tcPr/>
+          <w:p>
+            <w:pPr>
+              <w:pStyle w:val="Compact"/>
+            </w:pPr>
+            <w:r>
+              <w:t xml:space="preserve">S$22.5 million (95% UI: S$18.8 million–S$26.9 million)</w:t>
             </w:r>
           </w:p>
         </w:tc>
@@ -11711,51 +10921,51 @@
               <w:pStyle w:val="Compact"/>
             </w:pPr>
             <w:r>
-              <w:t xml:space="preserve">5,737 (95% UI: 4,939–6,617)</w:t>
-            </w:r>
-          </w:p>
-        </w:tc>
-        <w:tc>
-          <w:tcPr/>
-          <w:p>
-            <w:pPr>
-              <w:pStyle w:val="Compact"/>
-            </w:pPr>
-            <w:r>
-              <w:t xml:space="preserve">1,475 (95% UI: 1,237–1,745)</w:t>
-            </w:r>
-          </w:p>
-        </w:tc>
-        <w:tc>
-          <w:tcPr/>
-          <w:p>
-            <w:pPr>
-              <w:pStyle w:val="Compact"/>
-            </w:pPr>
-            <w:r>
-              <w:t xml:space="preserve">495 (95% UI: 360–834)</w:t>
-            </w:r>
-          </w:p>
-        </w:tc>
-        <w:tc>
-          <w:tcPr/>
-          <w:p>
-            <w:pPr>
-              <w:pStyle w:val="Compact"/>
-            </w:pPr>
-            <w:r>
-              <w:t xml:space="preserve">S$80.8 million (95% UI: S$67.1 million–S$98.3 million)</w:t>
-            </w:r>
-          </w:p>
-        </w:tc>
-        <w:tc>
-          <w:tcPr/>
-          <w:p>
-            <w:pPr>
-              <w:pStyle w:val="Compact"/>
-            </w:pPr>
-            <w:r>
-              <w:t xml:space="preserve">S$50.9 million (95% UI: S$42.5 million–S$60.6 million)</w:t>
+              <w:t xml:space="preserve">5,532 (95% UI: 4,754–6,415)</w:t>
+            </w:r>
+          </w:p>
+        </w:tc>
+        <w:tc>
+          <w:tcPr/>
+          <w:p>
+            <w:pPr>
+              <w:pStyle w:val="Compact"/>
+            </w:pPr>
+            <w:r>
+              <w:t xml:space="preserve">1,450 (95% UI: 1,214–1,716)</w:t>
+            </w:r>
+          </w:p>
+        </w:tc>
+        <w:tc>
+          <w:tcPr/>
+          <w:p>
+            <w:pPr>
+              <w:pStyle w:val="Compact"/>
+            </w:pPr>
+            <w:r>
+              <w:t xml:space="preserve">527 (95% UI: 382–877)</w:t>
+            </w:r>
+          </w:p>
+        </w:tc>
+        <w:tc>
+          <w:tcPr/>
+          <w:p>
+            <w:pPr>
+              <w:pStyle w:val="Compact"/>
+            </w:pPr>
+            <w:r>
+              <w:t xml:space="preserve">S$81.0 million (95% UI: S$67.1 million–S$99.3 million)</w:t>
+            </w:r>
+          </w:p>
+        </w:tc>
+        <w:tc>
+          <w:tcPr/>
+          <w:p>
+            <w:pPr>
+              <w:pStyle w:val="Compact"/>
+            </w:pPr>
+            <w:r>
+              <w:t xml:space="preserve">S$50.2 million (95% UI: S$41.9 million–S$59.8 million)</w:t>
             </w:r>
           </w:p>
         </w:tc>
@@ -11790,51 +11000,51 @@
               <w:pStyle w:val="Compact"/>
             </w:pPr>
             <w:r>
-              <w:t xml:space="preserve">9,169 (95% UI: 7,895–10,586)</w:t>
-            </w:r>
-          </w:p>
-        </w:tc>
-        <w:tc>
-          <w:tcPr/>
-          <w:p>
-            <w:pPr>
-              <w:pStyle w:val="Compact"/>
-            </w:pPr>
-            <w:r>
-              <w:t xml:space="preserve">2,086 (95% UI: 1,751–2,465)</w:t>
-            </w:r>
-          </w:p>
-        </w:tc>
-        <w:tc>
-          <w:tcPr/>
-          <w:p>
-            <w:pPr>
-              <w:pStyle w:val="Compact"/>
-            </w:pPr>
-            <w:r>
-              <w:t xml:space="preserve">399 (95% UI: 284–737)</w:t>
-            </w:r>
-          </w:p>
-        </w:tc>
-        <w:tc>
-          <w:tcPr/>
-          <w:p>
-            <w:pPr>
-              <w:pStyle w:val="Compact"/>
-            </w:pPr>
-            <w:r>
-              <w:t xml:space="preserve">S$102.6 million (95% UI: S$86.1 million–S$122.6 million)</w:t>
-            </w:r>
-          </w:p>
-        </w:tc>
-        <w:tc>
-          <w:tcPr/>
-          <w:p>
-            <w:pPr>
-              <w:pStyle w:val="Compact"/>
-            </w:pPr>
-            <w:r>
-              <w:t xml:space="preserve">S$72.7 million (95% UI: S$60.7 million–S$86.4 million)</w:t>
+              <w:t xml:space="preserve">8,843 (95% UI: 7,595–10,262)</w:t>
+            </w:r>
+          </w:p>
+        </w:tc>
+        <w:tc>
+          <w:tcPr/>
+          <w:p>
+            <w:pPr>
+              <w:pStyle w:val="Compact"/>
+            </w:pPr>
+            <w:r>
+              <w:t xml:space="preserve">2,058 (95% UI: 1,727–2,433)</w:t>
+            </w:r>
+          </w:p>
+        </w:tc>
+        <w:tc>
+          <w:tcPr/>
+          <w:p>
+            <w:pPr>
+              <w:pStyle w:val="Compact"/>
+            </w:pPr>
+            <w:r>
+              <w:t xml:space="preserve">432 (95% UI: 307–783)</w:t>
+            </w:r>
+          </w:p>
+        </w:tc>
+        <w:tc>
+          <w:tcPr/>
+          <w:p>
+            <w:pPr>
+              <w:pStyle w:val="Compact"/>
+            </w:pPr>
+            <w:r>
+              <w:t xml:space="preserve">S$102.7 million (95% UI: S$86.0 million–S$123.4 million)</w:t>
+            </w:r>
+          </w:p>
+        </w:tc>
+        <w:tc>
+          <w:tcPr/>
+          <w:p>
+            <w:pPr>
+              <w:pStyle w:val="Compact"/>
+            </w:pPr>
+            <w:r>
+              <w:t xml:space="preserve">S$71.9 million (95% UI: S$60.0 million–S$85.3 million)</w:t>
             </w:r>
           </w:p>
         </w:tc>
@@ -11869,51 +11079,51 @@
               <w:pStyle w:val="Compact"/>
             </w:pPr>
             <w:r>
-              <w:t xml:space="preserve">787 (95% UI: 682–894)</w:t>
-            </w:r>
-          </w:p>
-        </w:tc>
-        <w:tc>
-          <w:tcPr/>
-          <w:p>
-            <w:pPr>
-              <w:pStyle w:val="Compact"/>
-            </w:pPr>
-            <w:r>
-              <w:t xml:space="preserve">184 (95% UI: 155–221)</w:t>
-            </w:r>
-          </w:p>
-        </w:tc>
-        <w:tc>
-          <w:tcPr/>
-          <w:p>
-            <w:pPr>
-              <w:pStyle w:val="Compact"/>
-            </w:pPr>
-            <w:r>
-              <w:t xml:space="preserve">658 (95% UI: 490–1,019)</w:t>
-            </w:r>
-          </w:p>
-        </w:tc>
-        <w:tc>
-          <w:tcPr/>
-          <w:p>
-            <w:pPr>
-              <w:pStyle w:val="Compact"/>
-            </w:pPr>
-            <w:r>
-              <w:t xml:space="preserve">S$34.5 million (95% UI: S$26.9 million–S$48.9 million)</w:t>
-            </w:r>
-          </w:p>
-        </w:tc>
-        <w:tc>
-          <w:tcPr/>
-          <w:p>
-            <w:pPr>
-              <w:pStyle w:val="Compact"/>
-            </w:pPr>
-            <w:r>
-              <w:t xml:space="preserve">S$5.1 million (95% UI: S$4.3 million–S$6.1 million)</w:t>
+              <w:t xml:space="preserve">746 (95% UI: 645–852)</w:t>
+            </w:r>
+          </w:p>
+        </w:tc>
+        <w:tc>
+          <w:tcPr/>
+          <w:p>
+            <w:pPr>
+              <w:pStyle w:val="Compact"/>
+            </w:pPr>
+            <w:r>
+              <w:t xml:space="preserve">178 (95% UI: 150–214)</w:t>
+            </w:r>
+          </w:p>
+        </w:tc>
+        <w:tc>
+          <w:tcPr/>
+          <w:p>
+            <w:pPr>
+              <w:pStyle w:val="Compact"/>
+            </w:pPr>
+            <w:r>
+              <w:t xml:space="preserve">684 (95% UI: 509–1,049)</w:t>
+            </w:r>
+          </w:p>
+        </w:tc>
+        <w:tc>
+          <w:tcPr/>
+          <w:p>
+            <w:pPr>
+              <w:pStyle w:val="Compact"/>
+            </w:pPr>
+            <w:r>
+              <w:t xml:space="preserve">S$35.3 million (95% UI: S$27.5 million–S$50.2 million)</w:t>
+            </w:r>
+          </w:p>
+        </w:tc>
+        <w:tc>
+          <w:tcPr/>
+          <w:p>
+            <w:pPr>
+              <w:pStyle w:val="Compact"/>
+            </w:pPr>
+            <w:r>
+              <w:t xml:space="preserve">S$5.0 million (95% UI: S$4.2 million–S$6.0 million)</w:t>
             </w:r>
           </w:p>
         </w:tc>
@@ -11948,51 +11158,51 @@
               <w:pStyle w:val="Compact"/>
             </w:pPr>
             <w:r>
-              <w:t xml:space="preserve">1,310 (95% UI: 1,135–1,488)</w:t>
-            </w:r>
-          </w:p>
-        </w:tc>
-        <w:tc>
-          <w:tcPr/>
-          <w:p>
-            <w:pPr>
-              <w:pStyle w:val="Compact"/>
-            </w:pPr>
-            <w:r>
-              <w:t xml:space="preserve">300 (95% UI: 253–359)</w:t>
-            </w:r>
-          </w:p>
-        </w:tc>
-        <w:tc>
-          <w:tcPr/>
-          <w:p>
-            <w:pPr>
-              <w:pStyle w:val="Compact"/>
-            </w:pPr>
-            <w:r>
-              <w:t xml:space="preserve">620 (95% UI: 460–969)</w:t>
-            </w:r>
-          </w:p>
-        </w:tc>
-        <w:tc>
-          <w:tcPr/>
-          <w:p>
-            <w:pPr>
-              <w:pStyle w:val="Compact"/>
-            </w:pPr>
-            <w:r>
-              <w:t xml:space="preserve">S$37.8 million (95% UI: S$29.9 million–S$52.7 million)</w:t>
-            </w:r>
-          </w:p>
-        </w:tc>
-        <w:tc>
-          <w:tcPr/>
-          <w:p>
-            <w:pPr>
-              <w:pStyle w:val="Compact"/>
-            </w:pPr>
-            <w:r>
-              <w:t xml:space="preserve">S$8.4 million (95% UI: S$7.0 million–S$10.0 million)</w:t>
+              <w:t xml:space="preserve">1,242 (95% UI: 1,074–1,420)</w:t>
+            </w:r>
+          </w:p>
+        </w:tc>
+        <w:tc>
+          <w:tcPr/>
+          <w:p>
+            <w:pPr>
+              <w:pStyle w:val="Compact"/>
+            </w:pPr>
+            <w:r>
+              <w:t xml:space="preserve">292 (95% UI: 245–349)</w:t>
+            </w:r>
+          </w:p>
+        </w:tc>
+        <w:tc>
+          <w:tcPr/>
+          <w:p>
+            <w:pPr>
+              <w:pStyle w:val="Compact"/>
+            </w:pPr>
+            <w:r>
+              <w:t xml:space="preserve">647 (95% UI: 478–1,010)</w:t>
+            </w:r>
+          </w:p>
+        </w:tc>
+        <w:tc>
+          <w:tcPr/>
+          <w:p>
+            <w:pPr>
+              <w:pStyle w:val="Compact"/>
+            </w:pPr>
+            <w:r>
+              <w:t xml:space="preserve">S$38.5 million (95% UI: S$30.4 million–S$53.5 million)</w:t>
+            </w:r>
+          </w:p>
+        </w:tc>
+        <w:tc>
+          <w:tcPr/>
+          <w:p>
+            <w:pPr>
+              <w:pStyle w:val="Compact"/>
+            </w:pPr>
+            <w:r>
+              <w:t xml:space="preserve">S$8.2 million (95% UI: S$6.8 million–S$9.8 million)</w:t>
             </w:r>
           </w:p>
         </w:tc>
@@ -12027,51 +11237,51 @@
               <w:pStyle w:val="Compact"/>
             </w:pPr>
             <w:r>
-              <w:t xml:space="preserve">2,611 (95% UI: 2,266–2,971)</w:t>
-            </w:r>
-          </w:p>
-        </w:tc>
-        <w:tc>
-          <w:tcPr/>
-          <w:p>
-            <w:pPr>
-              <w:pStyle w:val="Compact"/>
-            </w:pPr>
-            <w:r>
-              <w:t xml:space="preserve">569 (95% UI: 479–679)</w:t>
-            </w:r>
-          </w:p>
-        </w:tc>
-        <w:tc>
-          <w:tcPr/>
-          <w:p>
-            <w:pPr>
-              <w:pStyle w:val="Compact"/>
-            </w:pPr>
-            <w:r>
-              <w:t xml:space="preserve">534 (95% UI: 390–878)</w:t>
-            </w:r>
-          </w:p>
-        </w:tc>
-        <w:tc>
-          <w:tcPr/>
-          <w:p>
-            <w:pPr>
-              <w:pStyle w:val="Compact"/>
-            </w:pPr>
-            <w:r>
-              <w:t xml:space="preserve">S$45.6 million (95% UI: S$36.8 million–S$61.0 million)</w:t>
-            </w:r>
-          </w:p>
-        </w:tc>
-        <w:tc>
-          <w:tcPr/>
-          <w:p>
-            <w:pPr>
-              <w:pStyle w:val="Compact"/>
-            </w:pPr>
-            <w:r>
-              <w:t xml:space="preserve">S$16.1 million (95% UI: S$13.4 million–S$19.2 million)</w:t>
+              <w:t xml:space="preserve">2,476 (95% UI: 2,141–2,832)</w:t>
+            </w:r>
+          </w:p>
+        </w:tc>
+        <w:tc>
+          <w:tcPr/>
+          <w:p>
+            <w:pPr>
+              <w:pStyle w:val="Compact"/>
+            </w:pPr>
+            <w:r>
+              <w:t xml:space="preserve">554 (95% UI: 465–661)</w:t>
+            </w:r>
+          </w:p>
+        </w:tc>
+        <w:tc>
+          <w:tcPr/>
+          <w:p>
+            <w:pPr>
+              <w:pStyle w:val="Compact"/>
+            </w:pPr>
+            <w:r>
+              <w:t xml:space="preserve">564 (95% UI: 412–918)</w:t>
+            </w:r>
+          </w:p>
+        </w:tc>
+        <w:tc>
+          <w:tcPr/>
+          <w:p>
+            <w:pPr>
+              <w:pStyle w:val="Compact"/>
+            </w:pPr>
+            <w:r>
+              <w:t xml:space="preserve">S$46.3 million (95% UI: S$37.1 million–S$62.0 million)</w:t>
+            </w:r>
+          </w:p>
+        </w:tc>
+        <w:tc>
+          <w:tcPr/>
+          <w:p>
+            <w:pPr>
+              <w:pStyle w:val="Compact"/>
+            </w:pPr>
+            <w:r>
+              <w:t xml:space="preserve">S$15.8 million (95% UI: S$13.1 million–S$18.9 million)</w:t>
             </w:r>
           </w:p>
         </w:tc>
@@ -12106,51 +11316,51 @@
               <w:pStyle w:val="Compact"/>
             </w:pPr>
             <w:r>
-              <w:t xml:space="preserve">6,483 (95% UI: 5,626–7,387)</w:t>
-            </w:r>
-          </w:p>
-        </w:tc>
-        <w:tc>
-          <w:tcPr/>
-          <w:p>
-            <w:pPr>
-              <w:pStyle w:val="Compact"/>
-            </w:pPr>
-            <w:r>
-              <w:t xml:space="preserve">1,226 (95% UI: 1,032–1,456)</w:t>
-            </w:r>
-          </w:p>
-        </w:tc>
-        <w:tc>
-          <w:tcPr/>
-          <w:p>
-            <w:pPr>
-              <w:pStyle w:val="Compact"/>
-            </w:pPr>
-            <w:r>
-              <w:t xml:space="preserve">349 (95% UI: 241–682)</w:t>
-            </w:r>
-          </w:p>
-        </w:tc>
-        <w:tc>
-          <w:tcPr/>
-          <w:p>
-            <w:pPr>
-              <w:pStyle w:val="Compact"/>
-            </w:pPr>
-            <w:r>
-              <w:t xml:space="preserve">S$66.0 million (95% UI: S$54.4 million–S$83.0 million)</w:t>
-            </w:r>
-          </w:p>
-        </w:tc>
-        <w:tc>
-          <w:tcPr/>
-          <w:p>
-            <w:pPr>
-              <w:pStyle w:val="Compact"/>
-            </w:pPr>
-            <w:r>
-              <w:t xml:space="preserve">S$36.2 million (95% UI: S$29.8 million–S$43.4 million)</w:t>
+              <w:t xml:space="preserve">6,146 (95% UI: 5,321–7,041)</w:t>
+            </w:r>
+          </w:p>
+        </w:tc>
+        <w:tc>
+          <w:tcPr/>
+          <w:p>
+            <w:pPr>
+              <w:pStyle w:val="Compact"/>
+            </w:pPr>
+            <w:r>
+              <w:t xml:space="preserve">1,203 (95% UI: 1,014–1,428)</w:t>
+            </w:r>
+          </w:p>
+        </w:tc>
+        <w:tc>
+          <w:tcPr/>
+          <w:p>
+            <w:pPr>
+              <w:pStyle w:val="Compact"/>
+            </w:pPr>
+            <w:r>
+              <w:t xml:space="preserve">382 (95% UI: 265–730)</w:t>
+            </w:r>
+          </w:p>
+        </w:tc>
+        <w:tc>
+          <w:tcPr/>
+          <w:p>
+            <w:pPr>
+              <w:pStyle w:val="Compact"/>
+            </w:pPr>
+            <w:r>
+              <w:t xml:space="preserve">S$66.4 million (95% UI: S$54.6 million–S$84.2 million)</w:t>
+            </w:r>
+          </w:p>
+        </w:tc>
+        <w:tc>
+          <w:tcPr/>
+          <w:p>
+            <w:pPr>
+              <w:pStyle w:val="Compact"/>
+            </w:pPr>
+            <w:r>
+              <w:t xml:space="preserve">S$35.7 million (95% UI: S$29.4 million–S$42.8 million)</w:t>
             </w:r>
           </w:p>
         </w:tc>
@@ -12185,51 +11395,51 @@
               <w:pStyle w:val="Compact"/>
             </w:pPr>
             <w:r>
-              <w:t xml:space="preserve">10,321 (95% UI: 8,954–11,761)</w:t>
-            </w:r>
-          </w:p>
-        </w:tc>
-        <w:tc>
-          <w:tcPr/>
-          <w:p>
-            <w:pPr>
-              <w:pStyle w:val="Compact"/>
-            </w:pPr>
-            <w:r>
-              <w:t xml:space="preserve">1,720 (95% UI: 1,453–2,035)</w:t>
-            </w:r>
-          </w:p>
-        </w:tc>
-        <w:tc>
-          <w:tcPr/>
-          <w:p>
-            <w:pPr>
-              <w:pStyle w:val="Compact"/>
-            </w:pPr>
-            <w:r>
-              <w:t xml:space="preserve">243 (95% UI: 155–579)</w:t>
-            </w:r>
-          </w:p>
-        </w:tc>
-        <w:tc>
-          <w:tcPr/>
-          <w:p>
-            <w:pPr>
-              <w:pStyle w:val="Compact"/>
-            </w:pPr>
-            <w:r>
-              <w:t xml:space="preserve">S$82.9 million (95% UI: S$69.1 million–S$102.0 million)</w:t>
-            </w:r>
-          </w:p>
-        </w:tc>
-        <w:tc>
-          <w:tcPr/>
-          <w:p>
-            <w:pPr>
-              <w:pStyle w:val="Compact"/>
-            </w:pPr>
-            <w:r>
-              <w:t xml:space="preserve">S$53.1 million (95% UI: S$43.6 million–S$63.6 million)</w:t>
+              <w:t xml:space="preserve">9,786 (95% UI: 8,479–11,228)</w:t>
+            </w:r>
+          </w:p>
+        </w:tc>
+        <w:tc>
+          <w:tcPr/>
+          <w:p>
+            <w:pPr>
+              <w:pStyle w:val="Compact"/>
+            </w:pPr>
+            <w:r>
+              <w:t xml:space="preserve">1,699 (95% UI: 1,435–2,011)</w:t>
+            </w:r>
+          </w:p>
+        </w:tc>
+        <w:tc>
+          <w:tcPr/>
+          <w:p>
+            <w:pPr>
+              <w:pStyle w:val="Compact"/>
+            </w:pPr>
+            <w:r>
+              <w:t xml:space="preserve">271 (95% UI: 175–622)</w:t>
+            </w:r>
+          </w:p>
+        </w:tc>
+        <w:tc>
+          <w:tcPr/>
+          <w:p>
+            <w:pPr>
+              <w:pStyle w:val="Compact"/>
+            </w:pPr>
+            <w:r>
+              <w:t xml:space="preserve">S$83.0 million (95% UI: S$68.9 million–S$102.7 million)</w:t>
+            </w:r>
+          </w:p>
+        </w:tc>
+        <w:tc>
+          <w:tcPr/>
+          <w:p>
+            <w:pPr>
+              <w:pStyle w:val="Compact"/>
+            </w:pPr>
+            <w:r>
+              <w:t xml:space="preserve">S$52.3 million (95% UI: S$43.0 million–S$62.7 million)</w:t>
             </w:r>
           </w:p>
         </w:tc>
@@ -12264,51 +11474,51 @@
               <w:pStyle w:val="Compact"/>
             </w:pPr>
             <w:r>
-              <w:t xml:space="preserve">881 (95% UI: 771–997)</w:t>
-            </w:r>
-          </w:p>
-        </w:tc>
-        <w:tc>
-          <w:tcPr/>
-          <w:p>
-            <w:pPr>
-              <w:pStyle w:val="Compact"/>
-            </w:pPr>
-            <w:r>
-              <w:t xml:space="preserve">153 (95% UI: 127–190)</w:t>
-            </w:r>
-          </w:p>
-        </w:tc>
-        <w:tc>
-          <w:tcPr/>
-          <w:p>
-            <w:pPr>
-              <w:pStyle w:val="Compact"/>
-            </w:pPr>
-            <w:r>
-              <w:t xml:space="preserve">629 (95% UI: 468–982)</w:t>
-            </w:r>
-          </w:p>
-        </w:tc>
-        <w:tc>
-          <w:tcPr/>
-          <w:p>
-            <w:pPr>
-              <w:pStyle w:val="Compact"/>
-            </w:pPr>
-            <w:r>
-              <w:t xml:space="preserve">S$32.2 million (95% UI: S$24.8 million–S$46.7 million)</w:t>
-            </w:r>
-          </w:p>
-        </w:tc>
-        <w:tc>
-          <w:tcPr/>
-          <w:p>
-            <w:pPr>
-              <w:pStyle w:val="Compact"/>
-            </w:pPr>
-            <w:r>
-              <w:t xml:space="preserve">S$2.9 million (95% UI: S$2.4 million–S$3.6 million)</w:t>
+              <w:t xml:space="preserve">824 (95% UI: 717–941)</w:t>
+            </w:r>
+          </w:p>
+        </w:tc>
+        <w:tc>
+          <w:tcPr/>
+          <w:p>
+            <w:pPr>
+              <w:pStyle w:val="Compact"/>
+            </w:pPr>
+            <w:r>
+              <w:t xml:space="preserve">146 (95% UI: 122–181)</w:t>
+            </w:r>
+          </w:p>
+        </w:tc>
+        <w:tc>
+          <w:tcPr/>
+          <w:p>
+            <w:pPr>
+              <w:pStyle w:val="Compact"/>
+            </w:pPr>
+            <w:r>
+              <w:t xml:space="preserve">656 (95% UI: 485–1,018)</w:t>
+            </w:r>
+          </w:p>
+        </w:tc>
+        <w:tc>
+          <w:tcPr/>
+          <w:p>
+            <w:pPr>
+              <w:pStyle w:val="Compact"/>
+            </w:pPr>
+            <w:r>
+              <w:t xml:space="preserve">S$33.0 million (95% UI: S$25.4 million–S$48.1 million)</w:t>
+            </w:r>
+          </w:p>
+        </w:tc>
+        <w:tc>
+          <w:tcPr/>
+          <w:p>
+            <w:pPr>
+              <w:pStyle w:val="Compact"/>
+            </w:pPr>
+            <w:r>
+              <w:t xml:space="preserve">S$2.8 million (95% UI: S$2.3 million–S$3.5 million)</w:t>
             </w:r>
           </w:p>
         </w:tc>
@@ -12343,51 +11553,51 @@
               <w:pStyle w:val="Compact"/>
             </w:pPr>
             <w:r>
-              <w:t xml:space="preserve">1,464 (95% UI: 1,282–1,659)</w:t>
-            </w:r>
-          </w:p>
-        </w:tc>
-        <w:tc>
-          <w:tcPr/>
-          <w:p>
-            <w:pPr>
-              <w:pStyle w:val="Compact"/>
-            </w:pPr>
-            <w:r>
-              <w:t xml:space="preserve">244 (95% UI: 203–302)</w:t>
-            </w:r>
-          </w:p>
-        </w:tc>
-        <w:tc>
-          <w:tcPr/>
-          <w:p>
-            <w:pPr>
-              <w:pStyle w:val="Compact"/>
-            </w:pPr>
-            <w:r>
-              <w:t xml:space="preserve">574 (95% UI: 424–922)</w:t>
-            </w:r>
-          </w:p>
-        </w:tc>
-        <w:tc>
-          <w:tcPr/>
-          <w:p>
-            <w:pPr>
-              <w:pStyle w:val="Compact"/>
-            </w:pPr>
-            <w:r>
-              <w:t xml:space="preserve">S$34.0 million (95% UI: S$26.5 million–S$48.7 million)</w:t>
-            </w:r>
-          </w:p>
-        </w:tc>
-        <w:tc>
-          <w:tcPr/>
-          <w:p>
-            <w:pPr>
-              <w:pStyle w:val="Compact"/>
-            </w:pPr>
-            <w:r>
-              <w:t xml:space="preserve">S$4.6 million (95% UI: S$3.8 million–S$5.8 million)</w:t>
+              <w:t xml:space="preserve">1,370 (95% UI: 1,192–1,566)</w:t>
+            </w:r>
+          </w:p>
+        </w:tc>
+        <w:tc>
+          <w:tcPr/>
+          <w:p>
+            <w:pPr>
+              <w:pStyle w:val="Compact"/>
+            </w:pPr>
+            <w:r>
+              <w:t xml:space="preserve">235 (95% UI: 195–290)</w:t>
+            </w:r>
+          </w:p>
+        </w:tc>
+        <w:tc>
+          <w:tcPr/>
+          <w:p>
+            <w:pPr>
+              <w:pStyle w:val="Compact"/>
+            </w:pPr>
+            <w:r>
+              <w:t xml:space="preserve">605 (95% UI: 444–964)</w:t>
+            </w:r>
+          </w:p>
+        </w:tc>
+        <w:tc>
+          <w:tcPr/>
+          <w:p>
+            <w:pPr>
+              <w:pStyle w:val="Compact"/>
+            </w:pPr>
+            <w:r>
+              <w:t xml:space="preserve">S$34.7 million (95% UI: S$27.0 million–S$49.9 million)</w:t>
+            </w:r>
+          </w:p>
+        </w:tc>
+        <w:tc>
+          <w:tcPr/>
+          <w:p>
+            <w:pPr>
+              <w:pStyle w:val="Compact"/>
+            </w:pPr>
+            <w:r>
+              <w:t xml:space="preserve">S$4.5 million (95% UI: S$3.7 million–S$5.6 million)</w:t>
             </w:r>
           </w:p>
         </w:tc>
@@ -12422,51 +11632,51 @@
               <w:pStyle w:val="Compact"/>
             </w:pPr>
             <w:r>
-              <w:t xml:space="preserve">2,912 (95% UI: 2,549–3,301)</w:t>
-            </w:r>
-          </w:p>
-        </w:tc>
-        <w:tc>
-          <w:tcPr/>
-          <w:p>
-            <w:pPr>
-              <w:pStyle w:val="Compact"/>
-            </w:pPr>
-            <w:r>
-              <w:t xml:space="preserve">442 (95% UI: 369–543)</w:t>
-            </w:r>
-          </w:p>
-        </w:tc>
-        <w:tc>
-          <w:tcPr/>
-          <w:p>
-            <w:pPr>
-              <w:pStyle w:val="Compact"/>
-            </w:pPr>
-            <w:r>
-              <w:t xml:space="preserve">460 (95% UI: 332–799)</w:t>
-            </w:r>
-          </w:p>
-        </w:tc>
-        <w:tc>
-          <w:tcPr/>
-          <w:p>
-            <w:pPr>
-              <w:pStyle w:val="Compact"/>
-            </w:pPr>
-            <w:r>
-              <w:t xml:space="preserve">S$38.0 million (95% UI: S$30.2 million–S$53.3 million)</w:t>
-            </w:r>
-          </w:p>
-        </w:tc>
-        <w:tc>
-          <w:tcPr/>
-          <w:p>
-            <w:pPr>
-              <w:pStyle w:val="Compact"/>
-            </w:pPr>
-            <w:r>
-              <w:t xml:space="preserve">S$8.7 million (95% UI: S$7.0 million–S$10.9 million)</w:t>
+              <w:t xml:space="preserve">2,728 (95% UI: 2,374–3,121)</w:t>
+            </w:r>
+          </w:p>
+        </w:tc>
+        <w:tc>
+          <w:tcPr/>
+          <w:p>
+            <w:pPr>
+              <w:pStyle w:val="Compact"/>
+            </w:pPr>
+            <w:r>
+              <w:t xml:space="preserve">428 (95% UI: 358–525)</w:t>
+            </w:r>
+          </w:p>
+        </w:tc>
+        <w:tc>
+          <w:tcPr/>
+          <w:p>
+            <w:pPr>
+              <w:pStyle w:val="Compact"/>
+            </w:pPr>
+            <w:r>
+              <w:t xml:space="preserve">493 (95% UI: 355–842)</w:t>
+            </w:r>
+          </w:p>
+        </w:tc>
+        <w:tc>
+          <w:tcPr/>
+          <w:p>
+            <w:pPr>
+              <w:pStyle w:val="Compact"/>
+            </w:pPr>
+            <w:r>
+              <w:t xml:space="preserve">S$38.7 million (95% UI: S$30.6 million–S$54.6 million)</w:t>
+            </w:r>
+          </w:p>
+        </w:tc>
+        <w:tc>
+          <w:tcPr/>
+          <w:p>
+            <w:pPr>
+              <w:pStyle w:val="Compact"/>
+            </w:pPr>
+            <w:r>
+              <w:t xml:space="preserve">S$8.4 million (95% UI: S$6.8 million–S$10.7 million)</w:t>
             </w:r>
           </w:p>
         </w:tc>
@@ -12501,51 +11711,51 @@
               <w:pStyle w:val="Compact"/>
             </w:pPr>
             <w:r>
-              <w:t xml:space="preserve">7,197 (95% UI: 6,295–8,182)</w:t>
-            </w:r>
-          </w:p>
-        </w:tc>
-        <w:tc>
-          <w:tcPr/>
-          <w:p>
-            <w:pPr>
-              <w:pStyle w:val="Compact"/>
-            </w:pPr>
-            <w:r>
-              <w:t xml:space="preserve">867 (95% UI: 729–1,042)</w:t>
-            </w:r>
-          </w:p>
-        </w:tc>
-        <w:tc>
-          <w:tcPr/>
-          <w:p>
-            <w:pPr>
-              <w:pStyle w:val="Compact"/>
-            </w:pPr>
-            <w:r>
-              <w:t xml:space="preserve">258 (95% UI: 166–591)</w:t>
-            </w:r>
-          </w:p>
-        </w:tc>
-        <w:tc>
-          <w:tcPr/>
-          <w:p>
-            <w:pPr>
-              <w:pStyle w:val="Compact"/>
-            </w:pPr>
-            <w:r>
-              <w:t xml:space="preserve">S$48.7 million (95% UI: S$39.8 million–S$65.5 million)</w:t>
-            </w:r>
-          </w:p>
-        </w:tc>
-        <w:tc>
-          <w:tcPr/>
-          <w:p>
-            <w:pPr>
-              <w:pStyle w:val="Compact"/>
-            </w:pPr>
-            <w:r>
-              <w:t xml:space="preserve">S$19.2 million (95% UI: S$15.0 million–S$24.3 million)</w:t>
+              <w:t xml:space="preserve">6,730 (95% UI: 5,868–7,736)</w:t>
+            </w:r>
+          </w:p>
+        </w:tc>
+        <w:tc>
+          <w:tcPr/>
+          <w:p>
+            <w:pPr>
+              <w:pStyle w:val="Compact"/>
+            </w:pPr>
+            <w:r>
+              <w:t xml:space="preserve">854 (95% UI: 717–1,027)</w:t>
+            </w:r>
+          </w:p>
+        </w:tc>
+        <w:tc>
+          <w:tcPr/>
+          <w:p>
+            <w:pPr>
+              <w:pStyle w:val="Compact"/>
+            </w:pPr>
+            <w:r>
+              <w:t xml:space="preserve">286 (95% UI: 186–639)</w:t>
+            </w:r>
+          </w:p>
+        </w:tc>
+        <w:tc>
+          <w:tcPr/>
+          <w:p>
+            <w:pPr>
+              <w:pStyle w:val="Compact"/>
+            </w:pPr>
+            <w:r>
+              <w:t xml:space="preserve">S$49.2 million (95% UI: S$40.0 million–S$66.6 million)</w:t>
+            </w:r>
+          </w:p>
+        </w:tc>
+        <w:tc>
+          <w:tcPr/>
+          <w:p>
+            <w:pPr>
+              <w:pStyle w:val="Compact"/>
+            </w:pPr>
+            <w:r>
+              <w:t xml:space="preserve">S$18.8 million (95% UI: S$14.7 million–S$23.8 million)</w:t>
             </w:r>
           </w:p>
         </w:tc>
@@ -12569,62 +11779,62 @@
               <w:pStyle w:val="Compact"/>
             </w:pPr>
             <w:r>
-              <w:t xml:space="preserve">37,635 (95% UI: 37,331–37,786)</w:t>
-            </w:r>
-          </w:p>
-        </w:tc>
-        <w:tc>
-          <w:tcPr/>
-          <w:p>
-            <w:pPr>
-              <w:pStyle w:val="Compact"/>
-            </w:pPr>
-            <w:r>
-              <w:t xml:space="preserve">10,705 (95% UI: 9,386–12,097)</w:t>
-            </w:r>
-          </w:p>
-        </w:tc>
-        <w:tc>
-          <w:tcPr/>
-          <w:p>
-            <w:pPr>
-              <w:pStyle w:val="Compact"/>
-            </w:pPr>
-            <w:r>
-              <w:t xml:space="preserve">1,162 (95% UI: 980–1,374)</w:t>
-            </w:r>
-          </w:p>
-        </w:tc>
-        <w:tc>
-          <w:tcPr/>
-          <w:p>
-            <w:pPr>
-              <w:pStyle w:val="Compact"/>
-            </w:pPr>
-            <w:r>
-              <w:t xml:space="preserve">184 (95% UI: 108–520)</w:t>
-            </w:r>
-          </w:p>
-        </w:tc>
-        <w:tc>
-          <w:tcPr/>
-          <w:p>
-            <w:pPr>
-              <w:pStyle w:val="Compact"/>
-            </w:pPr>
-            <w:r>
-              <w:t xml:space="preserve">S$59.0 million (95% UI: S$48.8 million–S$76.7 million)</w:t>
-            </w:r>
-          </w:p>
-        </w:tc>
-        <w:tc>
-          <w:tcPr/>
-          <w:p>
-            <w:pPr>
-              <w:pStyle w:val="Compact"/>
-            </w:pPr>
-            <w:r>
-              <w:t xml:space="preserve">S$29.4 million (95% UI: S$23.0 million–S$36.5 million)</w:t>
+              <w:t xml:space="preserve">40,000 (95% UI: 39,342–40,000)</w:t>
+            </w:r>
+          </w:p>
+        </w:tc>
+        <w:tc>
+          <w:tcPr/>
+          <w:p>
+            <w:pPr>
+              <w:pStyle w:val="Compact"/>
+            </w:pPr>
+            <w:r>
+              <w:t xml:space="preserve">10,669 (95% UI: 9,296–12,128)</w:t>
+            </w:r>
+          </w:p>
+        </w:tc>
+        <w:tc>
+          <w:tcPr/>
+          <w:p>
+            <w:pPr>
+              <w:pStyle w:val="Compact"/>
+            </w:pPr>
+            <w:r>
+              <w:t xml:space="preserve">1,157 (95% UI: 974–1,371)</w:t>
+            </w:r>
+          </w:p>
+        </w:tc>
+        <w:tc>
+          <w:tcPr/>
+          <w:p>
+            <w:pPr>
+              <w:pStyle w:val="Compact"/>
+            </w:pPr>
+            <w:r>
+              <w:t xml:space="preserve">195 (95% UI: 112–555)</w:t>
+            </w:r>
+          </w:p>
+        </w:tc>
+        <w:tc>
+          <w:tcPr/>
+          <w:p>
+            <w:pPr>
+              <w:pStyle w:val="Compact"/>
+            </w:pPr>
+            <w:r>
+              <w:t xml:space="preserve">S$59.2 million (95% UI: S$48.9 million–S$77.8 million)</w:t>
+            </w:r>
+          </w:p>
+        </w:tc>
+        <w:tc>
+          <w:tcPr/>
+          <w:p>
+            <w:pPr>
+              <w:pStyle w:val="Compact"/>
+            </w:pPr>
+            <w:r>
+              <w:t xml:space="preserve">S$28.8 million (95% UI: S$22.5 million–S$36.0 million)</w:t>
             </w:r>
           </w:p>
         </w:tc>
@@ -12648,62 +11858,62 @@
               <w:pStyle w:val="Compact"/>
             </w:pPr>
             <w:r>
-              <w:t xml:space="preserve">195,513 (95% UI: 184,513–201,592)</w:t>
-            </w:r>
-          </w:p>
-        </w:tc>
-        <w:tc>
-          <w:tcPr/>
-          <w:p>
-            <w:pPr>
-              <w:pStyle w:val="Compact"/>
-            </w:pPr>
-            <w:r>
-              <w:t xml:space="preserve">42,362 (95% UI: 36,953–48,201)</w:t>
-            </w:r>
-          </w:p>
-        </w:tc>
-        <w:tc>
-          <w:tcPr/>
-          <w:p>
-            <w:pPr>
-              <w:pStyle w:val="Compact"/>
-            </w:pPr>
-            <w:r>
-              <w:t xml:space="preserve">3,749 (95% UI: 3,164–4,395)</w:t>
-            </w:r>
-          </w:p>
-        </w:tc>
-        <w:tc>
-          <w:tcPr/>
-          <w:p>
-            <w:pPr>
-              <w:pStyle w:val="Compact"/>
-            </w:pPr>
-            <w:r>
-              <w:t xml:space="preserve">184 (95% UI: 108–520)</w:t>
-            </w:r>
-          </w:p>
-        </w:tc>
-        <w:tc>
-          <w:tcPr/>
-          <w:p>
-            <w:pPr>
-              <w:pStyle w:val="Compact"/>
-            </w:pPr>
-            <w:r>
-              <w:t xml:space="preserve">S$178.0 million (95% UI: S$152.1 million–S$206.7 million)</w:t>
-            </w:r>
-          </w:p>
-        </w:tc>
-        <w:tc>
-          <w:tcPr/>
-          <w:p>
-            <w:pPr>
-              <w:pStyle w:val="Compact"/>
-            </w:pPr>
-            <w:r>
-              <w:t xml:space="preserve">S$148.0 million (95% UI: S$124.9 million–S$173.0 million)</w:t>
+              <w:t xml:space="preserve">200,884 (95% UI: 188,411–207,758)</w:t>
+            </w:r>
+          </w:p>
+        </w:tc>
+        <w:tc>
+          <w:tcPr/>
+          <w:p>
+            <w:pPr>
+              <w:pStyle w:val="Compact"/>
+            </w:pPr>
+            <w:r>
+              <w:t xml:space="preserve">42,468 (95% UI: 36,987–48,347)</w:t>
+            </w:r>
+          </w:p>
+        </w:tc>
+        <w:tc>
+          <w:tcPr/>
+          <w:p>
+            <w:pPr>
+              <w:pStyle w:val="Compact"/>
+            </w:pPr>
+            <w:r>
+              <w:t xml:space="preserve">3,754 (95% UI: 3,168–4,403)</w:t>
+            </w:r>
+          </w:p>
+        </w:tc>
+        <w:tc>
+          <w:tcPr/>
+          <w:p>
+            <w:pPr>
+              <w:pStyle w:val="Compact"/>
+            </w:pPr>
+            <w:r>
+              <w:t xml:space="preserve">194 (95% UI: 111–555)</w:t>
+            </w:r>
+          </w:p>
+        </w:tc>
+        <w:tc>
+          <w:tcPr/>
+          <w:p>
+            <w:pPr>
+              <w:pStyle w:val="Compact"/>
+            </w:pPr>
+            <w:r>
+              <w:t xml:space="preserve">S$178.8 million (95% UI: S$152.7 million–S$207.4 million)</w:t>
+            </w:r>
+          </w:p>
+        </w:tc>
+        <w:tc>
+          <w:tcPr/>
+          <w:p>
+            <w:pPr>
+              <w:pStyle w:val="Compact"/>
+            </w:pPr>
+            <w:r>
+              <w:t xml:space="preserve">S$147.9 million (95% UI: S$124.9 million–S$172.9 million)</w:t>
             </w:r>
           </w:p>
         </w:tc>
@@ -13048,29 +12258,29 @@
               <w:pStyle w:val="Compact"/>
             </w:pPr>
             <w:r>
-              <w:t xml:space="preserve">S$14.7 (95% UI: S$11.1–S$21.7)</w:t>
-            </w:r>
-          </w:p>
-        </w:tc>
-        <w:tc>
-          <w:tcPr/>
-          <w:p>
-            <w:pPr>
-              <w:pStyle w:val="Compact"/>
-            </w:pPr>
-            <w:r>
-              <w:t xml:space="preserve">S$29.3 (95% UI: S$22.2–S$43.4)</w:t>
-            </w:r>
-          </w:p>
-        </w:tc>
-        <w:tc>
-          <w:tcPr/>
-          <w:p>
-            <w:pPr>
-              <w:pStyle w:val="Compact"/>
-            </w:pPr>
-            <w:r>
-              <w:t xml:space="preserve">S$44.0 (95% UI: S$33.4–S$65.1)</w:t>
+              <w:t xml:space="preserve">S$15.1 (95% UI: S$11.5–S$22.4)</w:t>
+            </w:r>
+          </w:p>
+        </w:tc>
+        <w:tc>
+          <w:tcPr/>
+          <w:p>
+            <w:pPr>
+              <w:pStyle w:val="Compact"/>
+            </w:pPr>
+            <w:r>
+              <w:t xml:space="preserve">S$30.3 (95% UI: S$22.9–S$44.7)</w:t>
+            </w:r>
+          </w:p>
+        </w:tc>
+        <w:tc>
+          <w:tcPr/>
+          <w:p>
+            <w:pPr>
+              <w:pStyle w:val="Compact"/>
+            </w:pPr>
+            <w:r>
+              <w:t xml:space="preserve">S$45.4 (95% UI: S$34.4–S$67.1)</w:t>
             </w:r>
           </w:p>
         </w:tc>
@@ -13094,29 +12304,29 @@
               <w:pStyle w:val="Compact"/>
             </w:pPr>
             <w:r>
-              <w:t xml:space="preserve">S$18.3 (95% UI: S$14.5–S$25.6)</w:t>
-            </w:r>
-          </w:p>
-        </w:tc>
-        <w:tc>
-          <w:tcPr/>
-          <w:p>
-            <w:pPr>
-              <w:pStyle w:val="Compact"/>
-            </w:pPr>
-            <w:r>
-              <w:t xml:space="preserve">S$36.7 (95% UI: S$28.9–S$51.2)</w:t>
-            </w:r>
-          </w:p>
-        </w:tc>
-        <w:tc>
-          <w:tcPr/>
-          <w:p>
-            <w:pPr>
-              <w:pStyle w:val="Compact"/>
-            </w:pPr>
-            <w:r>
-              <w:t xml:space="preserve">S$55.0 (95% UI: S$43.4–S$76.9)</w:t>
+              <w:t xml:space="preserve">S$18.7 (95% UI: S$14.7–S$26.2)</w:t>
+            </w:r>
+          </w:p>
+        </w:tc>
+        <w:tc>
+          <w:tcPr/>
+          <w:p>
+            <w:pPr>
+              <w:pStyle w:val="Compact"/>
+            </w:pPr>
+            <w:r>
+              <w:t xml:space="preserve">S$37.5 (95% UI: S$29.5–S$52.4)</w:t>
+            </w:r>
+          </w:p>
+        </w:tc>
+        <w:tc>
+          <w:tcPr/>
+          <w:p>
+            <w:pPr>
+              <w:pStyle w:val="Compact"/>
+            </w:pPr>
+            <w:r>
+              <w:t xml:space="preserve">S$56.2 (95% UI: S$44.2–S$78.6)</w:t>
             </w:r>
           </w:p>
         </w:tc>
@@ -13140,29 +12350,29 @@
               <w:pStyle w:val="Compact"/>
             </w:pPr>
             <w:r>
-              <w:t xml:space="preserve">S$20.7 (95% UI: S$16.5–S$28.1)</w:t>
-            </w:r>
-          </w:p>
-        </w:tc>
-        <w:tc>
-          <w:tcPr/>
-          <w:p>
-            <w:pPr>
-              <w:pStyle w:val="Compact"/>
-            </w:pPr>
-            <w:r>
-              <w:t xml:space="preserve">S$41.4 (95% UI: S$33.1–S$56.2)</w:t>
-            </w:r>
-          </w:p>
-        </w:tc>
-        <w:tc>
-          <w:tcPr/>
-          <w:p>
-            <w:pPr>
-              <w:pStyle w:val="Compact"/>
-            </w:pPr>
-            <w:r>
-              <w:t xml:space="preserve">S$62.1 (95% UI: S$49.6–S$84.3)</w:t>
+              <w:t xml:space="preserve">S$21.1 (95% UI: S$16.7–S$28.6)</w:t>
+            </w:r>
+          </w:p>
+        </w:tc>
+        <w:tc>
+          <w:tcPr/>
+          <w:p>
+            <w:pPr>
+              <w:pStyle w:val="Compact"/>
+            </w:pPr>
+            <w:r>
+              <w:t xml:space="preserve">S$42.1 (95% UI: S$33.5–S$57.2)</w:t>
+            </w:r>
+          </w:p>
+        </w:tc>
+        <w:tc>
+          <w:tcPr/>
+          <w:p>
+            <w:pPr>
+              <w:pStyle w:val="Compact"/>
+            </w:pPr>
+            <w:r>
+              <w:t xml:space="preserve">S$63.2 (95% UI: S$50.2–S$85.9)</w:t>
             </w:r>
           </w:p>
         </w:tc>
@@ -13186,29 +12396,29 @@
               <w:pStyle w:val="Compact"/>
             </w:pPr>
             <w:r>
-              <w:t xml:space="preserve">S$26.3 (95% UI: S$21.4–S$33.7)</w:t>
-            </w:r>
-          </w:p>
-        </w:tc>
-        <w:tc>
-          <w:tcPr/>
-          <w:p>
-            <w:pPr>
-              <w:pStyle w:val="Compact"/>
-            </w:pPr>
-            <w:r>
-              <w:t xml:space="preserve">S$52.5 (95% UI: S$42.8–S$67.4)</w:t>
-            </w:r>
-          </w:p>
-        </w:tc>
-        <w:tc>
-          <w:tcPr/>
-          <w:p>
-            <w:pPr>
-              <w:pStyle w:val="Compact"/>
-            </w:pPr>
-            <w:r>
-              <w:t xml:space="preserve">S$78.8 (95% UI: S$64.2–S$101.2)</w:t>
+              <w:t xml:space="preserve">S$26.6 (95% UI: S$21.5–S$34.3)</w:t>
+            </w:r>
+          </w:p>
+        </w:tc>
+        <w:tc>
+          <w:tcPr/>
+          <w:p>
+            <w:pPr>
+              <w:pStyle w:val="Compact"/>
+            </w:pPr>
+            <w:r>
+              <w:t xml:space="preserve">S$53.2 (95% UI: S$43.0–S$68.6)</w:t>
+            </w:r>
+          </w:p>
+        </w:tc>
+        <w:tc>
+          <w:tcPr/>
+          <w:p>
+            <w:pPr>
+              <w:pStyle w:val="Compact"/>
+            </w:pPr>
+            <w:r>
+              <w:t xml:space="preserve">S$79.7 (95% UI: S$64.5–S$102.9)</w:t>
             </w:r>
           </w:p>
         </w:tc>
@@ -13232,29 +12442,29 @@
               <w:pStyle w:val="Compact"/>
             </w:pPr>
             <w:r>
-              <w:t xml:space="preserve">S$40.4 (95% UI: S$33.5–S$49.2)</w:t>
-            </w:r>
-          </w:p>
-        </w:tc>
-        <w:tc>
-          <w:tcPr/>
-          <w:p>
-            <w:pPr>
-              <w:pStyle w:val="Compact"/>
-            </w:pPr>
-            <w:r>
-              <w:t xml:space="preserve">S$80.8 (95% UI: S$67.1–S$98.3)</w:t>
-            </w:r>
-          </w:p>
-        </w:tc>
-        <w:tc>
-          <w:tcPr/>
-          <w:p>
-            <w:pPr>
-              <w:pStyle w:val="Compact"/>
-            </w:pPr>
-            <w:r>
-              <w:t xml:space="preserve">S$121.3 (95% UI: S$100.6–S$147.5)</w:t>
+              <w:t xml:space="preserve">S$40.5 (95% UI: S$33.6–S$49.6)</w:t>
+            </w:r>
+          </w:p>
+        </w:tc>
+        <w:tc>
+          <w:tcPr/>
+          <w:p>
+            <w:pPr>
+              <w:pStyle w:val="Compact"/>
+            </w:pPr>
+            <w:r>
+              <w:t xml:space="preserve">S$81.0 (95% UI: S$67.1–S$99.3)</w:t>
+            </w:r>
+          </w:p>
+        </w:tc>
+        <w:tc>
+          <w:tcPr/>
+          <w:p>
+            <w:pPr>
+              <w:pStyle w:val="Compact"/>
+            </w:pPr>
+            <w:r>
+              <w:t xml:space="preserve">S$121.5 (95% UI: S$100.7–S$148.9)</w:t>
             </w:r>
           </w:p>
         </w:tc>
@@ -13278,29 +12488,29 @@
               <w:pStyle w:val="Compact"/>
             </w:pPr>
             <w:r>
-              <w:t xml:space="preserve">S$51.3 (95% UI: S$43.0–S$61.3)</w:t>
-            </w:r>
-          </w:p>
-        </w:tc>
-        <w:tc>
-          <w:tcPr/>
-          <w:p>
-            <w:pPr>
-              <w:pStyle w:val="Compact"/>
-            </w:pPr>
-            <w:r>
-              <w:t xml:space="preserve">S$102.6 (95% UI: S$86.1–S$122.6)</w:t>
-            </w:r>
-          </w:p>
-        </w:tc>
-        <w:tc>
-          <w:tcPr/>
-          <w:p>
-            <w:pPr>
-              <w:pStyle w:val="Compact"/>
-            </w:pPr>
-            <w:r>
-              <w:t xml:space="preserve">S$153.9 (95% UI: S$129.1–S$184.0)</w:t>
+              <w:t xml:space="preserve">S$51.3 (95% UI: S$43.0–S$61.7)</w:t>
+            </w:r>
+          </w:p>
+        </w:tc>
+        <w:tc>
+          <w:tcPr/>
+          <w:p>
+            <w:pPr>
+              <w:pStyle w:val="Compact"/>
+            </w:pPr>
+            <w:r>
+              <w:t xml:space="preserve">S$102.7 (95% UI: S$86.0–S$123.4)</w:t>
+            </w:r>
+          </w:p>
+        </w:tc>
+        <w:tc>
+          <w:tcPr/>
+          <w:p>
+            <w:pPr>
+              <w:pStyle w:val="Compact"/>
+            </w:pPr>
+            <w:r>
+              <w:t xml:space="preserve">S$154.0 (95% UI: S$129.0–S$185.0)</w:t>
             </w:r>
           </w:p>
         </w:tc>
@@ -13324,29 +12534,29 @@
               <w:pStyle w:val="Compact"/>
             </w:pPr>
             <w:r>
-              <w:t xml:space="preserve">S$17.2 (95% UI: S$13.4–S$24.4)</w:t>
-            </w:r>
-          </w:p>
-        </w:tc>
-        <w:tc>
-          <w:tcPr/>
-          <w:p>
-            <w:pPr>
-              <w:pStyle w:val="Compact"/>
-            </w:pPr>
-            <w:r>
-              <w:t xml:space="preserve">S$34.5 (95% UI: S$26.9–S$48.9)</w:t>
-            </w:r>
-          </w:p>
-        </w:tc>
-        <w:tc>
-          <w:tcPr/>
-          <w:p>
-            <w:pPr>
-              <w:pStyle w:val="Compact"/>
-            </w:pPr>
-            <w:r>
-              <w:t xml:space="preserve">S$51.7 (95% UI: S$40.3–S$73.3)</w:t>
+              <w:t xml:space="preserve">S$17.7 (95% UI: S$13.7–S$25.1)</w:t>
+            </w:r>
+          </w:p>
+        </w:tc>
+        <w:tc>
+          <w:tcPr/>
+          <w:p>
+            <w:pPr>
+              <w:pStyle w:val="Compact"/>
+            </w:pPr>
+            <w:r>
+              <w:t xml:space="preserve">S$35.3 (95% UI: S$27.5–S$50.2)</w:t>
+            </w:r>
+          </w:p>
+        </w:tc>
+        <w:tc>
+          <w:tcPr/>
+          <w:p>
+            <w:pPr>
+              <w:pStyle w:val="Compact"/>
+            </w:pPr>
+            <w:r>
+              <w:t xml:space="preserve">S$53.0 (95% UI: S$41.2–S$75.3)</w:t>
             </w:r>
           </w:p>
         </w:tc>
@@ -13370,29 +12580,29 @@
               <w:pStyle w:val="Compact"/>
             </w:pPr>
             <w:r>
-              <w:t xml:space="preserve">S$18.9 (95% UI: S$15.0–S$26.4)</w:t>
-            </w:r>
-          </w:p>
-        </w:tc>
-        <w:tc>
-          <w:tcPr/>
-          <w:p>
-            <w:pPr>
-              <w:pStyle w:val="Compact"/>
-            </w:pPr>
-            <w:r>
-              <w:t xml:space="preserve">S$37.8 (95% UI: S$29.9–S$52.7)</w:t>
-            </w:r>
-          </w:p>
-        </w:tc>
-        <w:tc>
-          <w:tcPr/>
-          <w:p>
-            <w:pPr>
-              <w:pStyle w:val="Compact"/>
-            </w:pPr>
-            <w:r>
-              <w:t xml:space="preserve">S$56.6 (95% UI: S$44.9–S$79.1)</w:t>
+              <w:t xml:space="preserve">S$19.2 (95% UI: S$15.2–S$26.7)</w:t>
+            </w:r>
+          </w:p>
+        </w:tc>
+        <w:tc>
+          <w:tcPr/>
+          <w:p>
+            <w:pPr>
+              <w:pStyle w:val="Compact"/>
+            </w:pPr>
+            <w:r>
+              <w:t xml:space="preserve">S$38.5 (95% UI: S$30.4–S$53.5)</w:t>
+            </w:r>
+          </w:p>
+        </w:tc>
+        <w:tc>
+          <w:tcPr/>
+          <w:p>
+            <w:pPr>
+              <w:pStyle w:val="Compact"/>
+            </w:pPr>
+            <w:r>
+              <w:t xml:space="preserve">S$57.7 (95% UI: S$45.5–S$80.2)</w:t>
             </w:r>
           </w:p>
         </w:tc>
@@ -13416,29 +12626,29 @@
               <w:pStyle w:val="Compact"/>
             </w:pPr>
             <w:r>
-              <w:t xml:space="preserve">S$22.8 (95% UI: S$18.4–S$30.5)</w:t>
-            </w:r>
-          </w:p>
-        </w:tc>
-        <w:tc>
-          <w:tcPr/>
-          <w:p>
-            <w:pPr>
-              <w:pStyle w:val="Compact"/>
-            </w:pPr>
-            <w:r>
-              <w:t xml:space="preserve">S$45.6 (95% UI: S$36.8–S$61.0)</w:t>
-            </w:r>
-          </w:p>
-        </w:tc>
-        <w:tc>
-          <w:tcPr/>
-          <w:p>
-            <w:pPr>
-              <w:pStyle w:val="Compact"/>
-            </w:pPr>
-            <w:r>
-              <w:t xml:space="preserve">S$68.5 (95% UI: S$55.2–S$91.4)</w:t>
+              <w:t xml:space="preserve">S$23.1 (95% UI: S$18.6–S$31.0)</w:t>
+            </w:r>
+          </w:p>
+        </w:tc>
+        <w:tc>
+          <w:tcPr/>
+          <w:p>
+            <w:pPr>
+              <w:pStyle w:val="Compact"/>
+            </w:pPr>
+            <w:r>
+              <w:t xml:space="preserve">S$46.3 (95% UI: S$37.1–S$62.0)</w:t>
+            </w:r>
+          </w:p>
+        </w:tc>
+        <w:tc>
+          <w:tcPr/>
+          <w:p>
+            <w:pPr>
+              <w:pStyle w:val="Compact"/>
+            </w:pPr>
+            <w:r>
+              <w:t xml:space="preserve">S$69.4 (95% UI: S$55.7–S$93.1)</w:t>
             </w:r>
           </w:p>
         </w:tc>
@@ -13462,29 +12672,29 @@
               <w:pStyle w:val="Compact"/>
             </w:pPr>
             <w:r>
-              <w:t xml:space="preserve">S$33.0 (95% UI: S$27.2–S$41.5)</w:t>
-            </w:r>
-          </w:p>
-        </w:tc>
-        <w:tc>
-          <w:tcPr/>
-          <w:p>
-            <w:pPr>
-              <w:pStyle w:val="Compact"/>
-            </w:pPr>
-            <w:r>
-              <w:t xml:space="preserve">S$66.0 (95% UI: S$54.4–S$83.0)</w:t>
-            </w:r>
-          </w:p>
-        </w:tc>
-        <w:tc>
-          <w:tcPr/>
-          <w:p>
-            <w:pPr>
-              <w:pStyle w:val="Compact"/>
-            </w:pPr>
-            <w:r>
-              <w:t xml:space="preserve">S$99.0 (95% UI: S$81.7–S$124.4)</w:t>
+              <w:t xml:space="preserve">S$33.2 (95% UI: S$27.3–S$42.1)</w:t>
+            </w:r>
+          </w:p>
+        </w:tc>
+        <w:tc>
+          <w:tcPr/>
+          <w:p>
+            <w:pPr>
+              <w:pStyle w:val="Compact"/>
+            </w:pPr>
+            <w:r>
+              <w:t xml:space="preserve">S$66.4 (95% UI: S$54.6–S$84.2)</w:t>
+            </w:r>
+          </w:p>
+        </w:tc>
+        <w:tc>
+          <w:tcPr/>
+          <w:p>
+            <w:pPr>
+              <w:pStyle w:val="Compact"/>
+            </w:pPr>
+            <w:r>
+              <w:t xml:space="preserve">S$99.6 (95% UI: S$82.0–S$126.3)</w:t>
             </w:r>
           </w:p>
         </w:tc>
@@ -13508,29 +12718,29 @@
               <w:pStyle w:val="Compact"/>
             </w:pPr>
             <w:r>
-              <w:t xml:space="preserve">S$41.4 (95% UI: S$34.5–S$51.0)</w:t>
-            </w:r>
-          </w:p>
-        </w:tc>
-        <w:tc>
-          <w:tcPr/>
-          <w:p>
-            <w:pPr>
-              <w:pStyle w:val="Compact"/>
-            </w:pPr>
-            <w:r>
-              <w:t xml:space="preserve">S$82.9 (95% UI: S$69.1–S$102.0)</w:t>
-            </w:r>
-          </w:p>
-        </w:tc>
-        <w:tc>
-          <w:tcPr/>
-          <w:p>
-            <w:pPr>
-              <w:pStyle w:val="Compact"/>
-            </w:pPr>
-            <w:r>
-              <w:t xml:space="preserve">S$124.3 (95% UI: S$103.6–S$152.9)</w:t>
+              <w:t xml:space="preserve">S$41.5 (95% UI: S$34.5–S$51.3)</w:t>
+            </w:r>
+          </w:p>
+        </w:tc>
+        <w:tc>
+          <w:tcPr/>
+          <w:p>
+            <w:pPr>
+              <w:pStyle w:val="Compact"/>
+            </w:pPr>
+            <w:r>
+              <w:t xml:space="preserve">S$83.0 (95% UI: S$68.9–S$102.7)</w:t>
+            </w:r>
+          </w:p>
+        </w:tc>
+        <w:tc>
+          <w:tcPr/>
+          <w:p>
+            <w:pPr>
+              <w:pStyle w:val="Compact"/>
+            </w:pPr>
+            <w:r>
+              <w:t xml:space="preserve">S$124.6 (95% UI: S$103.4–S$154.0)</w:t>
             </w:r>
           </w:p>
         </w:tc>
@@ -13554,29 +12764,29 @@
               <w:pStyle w:val="Compact"/>
             </w:pPr>
             <w:r>
-              <w:t xml:space="preserve">S$16.1 (95% UI: S$12.4–S$23.4)</w:t>
-            </w:r>
-          </w:p>
-        </w:tc>
-        <w:tc>
-          <w:tcPr/>
-          <w:p>
-            <w:pPr>
-              <w:pStyle w:val="Compact"/>
-            </w:pPr>
-            <w:r>
-              <w:t xml:space="preserve">S$32.2 (95% UI: S$24.8–S$46.7)</w:t>
-            </w:r>
-          </w:p>
-        </w:tc>
-        <w:tc>
-          <w:tcPr/>
-          <w:p>
-            <w:pPr>
-              <w:pStyle w:val="Compact"/>
-            </w:pPr>
-            <w:r>
-              <w:t xml:space="preserve">S$48.4 (95% UI: S$37.3–S$70.1)</w:t>
+              <w:t xml:space="preserve">S$16.5 (95% UI: S$12.7–S$24.1)</w:t>
+            </w:r>
+          </w:p>
+        </w:tc>
+        <w:tc>
+          <w:tcPr/>
+          <w:p>
+            <w:pPr>
+              <w:pStyle w:val="Compact"/>
+            </w:pPr>
+            <w:r>
+              <w:t xml:space="preserve">S$33.0 (95% UI: S$25.4–S$48.1)</w:t>
+            </w:r>
+          </w:p>
+        </w:tc>
+        <w:tc>
+          <w:tcPr/>
+          <w:p>
+            <w:pPr>
+              <w:pStyle w:val="Compact"/>
+            </w:pPr>
+            <w:r>
+              <w:t xml:space="preserve">S$49.6 (95% UI: S$38.1–S$72.2)</w:t>
             </w:r>
           </w:p>
         </w:tc>
@@ -13600,29 +12810,29 @@
               <w:pStyle w:val="Compact"/>
             </w:pPr>
             <w:r>
-              <w:t xml:space="preserve">S$17.0 (95% UI: S$13.3–S$24.4)</w:t>
-            </w:r>
-          </w:p>
-        </w:tc>
-        <w:tc>
-          <w:tcPr/>
-          <w:p>
-            <w:pPr>
-              <w:pStyle w:val="Compact"/>
-            </w:pPr>
-            <w:r>
-              <w:t xml:space="preserve">S$34.0 (95% UI: S$26.5–S$48.7)</w:t>
-            </w:r>
-          </w:p>
-        </w:tc>
-        <w:tc>
-          <w:tcPr/>
-          <w:p>
-            <w:pPr>
-              <w:pStyle w:val="Compact"/>
-            </w:pPr>
-            <w:r>
-              <w:t xml:space="preserve">S$51.0 (95% UI: S$39.8–S$73.1)</w:t>
+              <w:t xml:space="preserve">S$17.4 (95% UI: S$13.5–S$24.9)</w:t>
+            </w:r>
+          </w:p>
+        </w:tc>
+        <w:tc>
+          <w:tcPr/>
+          <w:p>
+            <w:pPr>
+              <w:pStyle w:val="Compact"/>
+            </w:pPr>
+            <w:r>
+              <w:t xml:space="preserve">S$34.7 (95% UI: S$27.0–S$49.9)</w:t>
+            </w:r>
+          </w:p>
+        </w:tc>
+        <w:tc>
+          <w:tcPr/>
+          <w:p>
+            <w:pPr>
+              <w:pStyle w:val="Compact"/>
+            </w:pPr>
+            <w:r>
+              <w:t xml:space="preserve">S$52.1 (95% UI: S$40.5–S$74.8)</w:t>
             </w:r>
           </w:p>
         </w:tc>
@@ -13646,29 +12856,29 @@
               <w:pStyle w:val="Compact"/>
             </w:pPr>
             <w:r>
-              <w:t xml:space="preserve">S$19.0 (95% UI: S$15.1–S$26.6)</w:t>
-            </w:r>
-          </w:p>
-        </w:tc>
-        <w:tc>
-          <w:tcPr/>
-          <w:p>
-            <w:pPr>
-              <w:pStyle w:val="Compact"/>
-            </w:pPr>
-            <w:r>
-              <w:t xml:space="preserve">S$38.0 (95% UI: S$30.2–S$53.3)</w:t>
-            </w:r>
-          </w:p>
-        </w:tc>
-        <w:tc>
-          <w:tcPr/>
-          <w:p>
-            <w:pPr>
-              <w:pStyle w:val="Compact"/>
-            </w:pPr>
-            <w:r>
-              <w:t xml:space="preserve">S$57.0 (95% UI: S$45.3–S$79.9)</w:t>
+              <w:t xml:space="preserve">S$19.4 (95% UI: S$15.3–S$27.3)</w:t>
+            </w:r>
+          </w:p>
+        </w:tc>
+        <w:tc>
+          <w:tcPr/>
+          <w:p>
+            <w:pPr>
+              <w:pStyle w:val="Compact"/>
+            </w:pPr>
+            <w:r>
+              <w:t xml:space="preserve">S$38.7 (95% UI: S$30.6–S$54.6)</w:t>
+            </w:r>
+          </w:p>
+        </w:tc>
+        <w:tc>
+          <w:tcPr/>
+          <w:p>
+            <w:pPr>
+              <w:pStyle w:val="Compact"/>
+            </w:pPr>
+            <w:r>
+              <w:t xml:space="preserve">S$58.1 (95% UI: S$45.9–S$82.0)</w:t>
             </w:r>
           </w:p>
         </w:tc>
@@ -13692,29 +12902,29 @@
               <w:pStyle w:val="Compact"/>
             </w:pPr>
             <w:r>
-              <w:t xml:space="preserve">S$24.3 (95% UI: S$19.9–S$32.8)</w:t>
-            </w:r>
-          </w:p>
-        </w:tc>
-        <w:tc>
-          <w:tcPr/>
-          <w:p>
-            <w:pPr>
-              <w:pStyle w:val="Compact"/>
-            </w:pPr>
-            <w:r>
-              <w:t xml:space="preserve">S$48.7 (95% UI: S$39.8–S$65.5)</w:t>
-            </w:r>
-          </w:p>
-        </w:tc>
-        <w:tc>
-          <w:tcPr/>
-          <w:p>
-            <w:pPr>
-              <w:pStyle w:val="Compact"/>
-            </w:pPr>
-            <w:r>
-              <w:t xml:space="preserve">S$73.0 (95% UI: S$59.6–S$98.3)</w:t>
+              <w:t xml:space="preserve">S$24.6 (95% UI: S$20.0–S$33.3)</w:t>
+            </w:r>
+          </w:p>
+        </w:tc>
+        <w:tc>
+          <w:tcPr/>
+          <w:p>
+            <w:pPr>
+              <w:pStyle w:val="Compact"/>
+            </w:pPr>
+            <w:r>
+              <w:t xml:space="preserve">S$49.2 (95% UI: S$40.0–S$66.6)</w:t>
+            </w:r>
+          </w:p>
+        </w:tc>
+        <w:tc>
+          <w:tcPr/>
+          <w:p>
+            <w:pPr>
+              <w:pStyle w:val="Compact"/>
+            </w:pPr>
+            <w:r>
+              <w:t xml:space="preserve">S$73.9 (95% UI: S$60.0–S$99.8)</w:t>
             </w:r>
           </w:p>
         </w:tc>
@@ -13738,29 +12948,29 @@
               <w:pStyle w:val="Compact"/>
             </w:pPr>
             <w:r>
-              <w:t xml:space="preserve">S$29.5 (95% UI: S$24.4–S$38.3)</w:t>
-            </w:r>
-          </w:p>
-        </w:tc>
-        <w:tc>
-          <w:tcPr/>
-          <w:p>
-            <w:pPr>
-              <w:pStyle w:val="Compact"/>
-            </w:pPr>
-            <w:r>
-              <w:t xml:space="preserve">S$59.0 (95% UI: S$48.8–S$76.7)</w:t>
-            </w:r>
-          </w:p>
-        </w:tc>
-        <w:tc>
-          <w:tcPr/>
-          <w:p>
-            <w:pPr>
-              <w:pStyle w:val="Compact"/>
-            </w:pPr>
-            <w:r>
-              <w:t xml:space="preserve">S$88.5 (95% UI: S$73.2–S$115.0)</w:t>
+              <w:t xml:space="preserve">S$29.6 (95% UI: S$24.4–S$38.9)</w:t>
+            </w:r>
+          </w:p>
+        </w:tc>
+        <w:tc>
+          <w:tcPr/>
+          <w:p>
+            <w:pPr>
+              <w:pStyle w:val="Compact"/>
+            </w:pPr>
+            <w:r>
+              <w:t xml:space="preserve">S$59.2 (95% UI: S$48.9–S$77.8)</w:t>
+            </w:r>
+          </w:p>
+        </w:tc>
+        <w:tc>
+          <w:tcPr/>
+          <w:p>
+            <w:pPr>
+              <w:pStyle w:val="Compact"/>
+            </w:pPr>
+            <w:r>
+              <w:t xml:space="preserve">S$88.9 (95% UI: S$73.3–S$116.7)</w:t>
             </w:r>
           </w:p>
         </w:tc>
@@ -13784,29 +12994,29 @@
               <w:pStyle w:val="Compact"/>
             </w:pPr>
             <w:r>
-              <w:t xml:space="preserve">S$89.0 (95% UI: S$76.1–S$103.3)</w:t>
-            </w:r>
-          </w:p>
-        </w:tc>
-        <w:tc>
-          <w:tcPr/>
-          <w:p>
-            <w:pPr>
-              <w:pStyle w:val="Compact"/>
-            </w:pPr>
-            <w:r>
-              <w:t xml:space="preserve">S$178.0 (95% UI: S$152.1–S$206.7)</w:t>
-            </w:r>
-          </w:p>
-        </w:tc>
-        <w:tc>
-          <w:tcPr/>
-          <w:p>
-            <w:pPr>
-              <w:pStyle w:val="Compact"/>
-            </w:pPr>
-            <w:r>
-              <w:t xml:space="preserve">S$267.0 (95% UI: S$228.2–S$310.0)</w:t>
+              <w:t xml:space="preserve">S$89.4 (95% UI: S$76.4–S$103.7)</w:t>
+            </w:r>
+          </w:p>
+        </w:tc>
+        <w:tc>
+          <w:tcPr/>
+          <w:p>
+            <w:pPr>
+              <w:pStyle w:val="Compact"/>
+            </w:pPr>
+            <w:r>
+              <w:t xml:space="preserve">S$178.8 (95% UI: S$152.7–S$207.4)</w:t>
+            </w:r>
+          </w:p>
+        </w:tc>
+        <w:tc>
+          <w:tcPr/>
+          <w:p>
+            <w:pPr>
+              <w:pStyle w:val="Compact"/>
+            </w:pPr>
+            <w:r>
+              <w:t xml:space="preserve">S$268.2 (95% UI: S$229.1–S$311.1)</w:t>
             </w:r>
           </w:p>
         </w:tc>
@@ -13929,7 +13139,7 @@
         <w:t xml:space="preserve">[31]</w:t>
       </w:r>
       <w:r>
-        <w:t xml:space="preserve">. The model gave 200 (95% UI: 157–272) prison treatment starts in 2026 because most prevalent cases had been treated by then.</w:t>
+        <w:t xml:space="preserve">. The model gave 204 (95% UI: 161–276) prison treatment starts in 2026 because most prevalent cases had been treated by then.</w:t>
       </w:r>
     </w:p>
     <w:p>

</xml_diff>

<commit_message>
docs(manuscript): report yearly counts and the narrow 5,000-test result
- Main text and S1 Text define new infections and HCV deaths as counts over
  each calendar year (2015 = one year at equilibrium) and quote the rerun.
- 5,000 tests a year with 25% to F is described as meeting the targets only
  narrowly (65.4%, 0.4 points above the target; both targets in 60% of
  draws); checks() stops the build if that changes.
- Scenarios README table and summary regenerated from the summary CSV;
  claude.md updated.

Co-Authored-By: Claude Opus 5.5 <noreply@anthropic.com>
</commit_message>
<xml_diff>
--- a/docs/Supplementary Information.docx
+++ b/docs/Supplementary Information.docx
@@ -6342,7 +6342,7 @@
         <w:pStyle w:val="BodyText"/>
       </w:pPr>
       <w:r>
-        <w:t xml:space="preserve">New infections in a year were the instantaneous annual rate of infection (u and r to a, in D and F) at the end of the year. HCV deaths were the liver deaths in stages 3 and 4 plus</w:t>
+        <w:t xml:space="preserve">New infections in a year were the infections (u and r to a, in D and F) during that calendar year, and HCV deaths the liver deaths in stages 3 and 4 plus</w:t>
       </w:r>
       <w:r>
         <w:t xml:space="preserve"> </w:t>
@@ -6407,7 +6407,7 @@
         <w:t xml:space="preserve"> </w:t>
       </w:r>
       <w:r>
-        <w:t xml:space="preserve">times the number of viraemic people. Both were compared with their 2015 values.</w:t>
+        <w:t xml:space="preserve">times the number of viraemic people, summed over the year (trapezoid rule over the daily solver output). The 2015 values were one year at the calibrated equilibrium; the 2016 values, still without treatment, differed from them by less than 0.1%. Both were compared with their 2015 values.</w:t>
       </w:r>
     </w:p>
     <w:p>
@@ -6882,7 +6882,7 @@
               <w:pStyle w:val="Compact"/>
             </w:pPr>
             <w:r>
-              <w:t xml:space="preserve">78.0%</w:t>
+              <w:t xml:space="preserve">71.2%</w:t>
             </w:r>
           </w:p>
         </w:tc>
@@ -6939,7 +6939,7 @@
               <w:pStyle w:val="Compact"/>
             </w:pPr>
             <w:r>
-              <w:t xml:space="preserve">83.4%</w:t>
+              <w:t xml:space="preserve">79.0%</w:t>
             </w:r>
           </w:p>
         </w:tc>
@@ -6996,7 +6996,7 @@
               <w:pStyle w:val="Compact"/>
             </w:pPr>
             <w:r>
-              <w:t xml:space="preserve">87.1%</w:t>
+              <w:t xml:space="preserve">84.2%</w:t>
             </w:r>
           </w:p>
         </w:tc>
@@ -7053,7 +7053,7 @@
               <w:pStyle w:val="Compact"/>
             </w:pPr>
             <w:r>
-              <w:t xml:space="preserve">90.2%</w:t>
+              <w:t xml:space="preserve">88.1%</w:t>
             </w:r>
           </w:p>
         </w:tc>
@@ -7110,7 +7110,7 @@
               <w:pStyle w:val="Compact"/>
             </w:pPr>
             <w:r>
-              <w:t xml:space="preserve">86.2%</w:t>
+              <w:t xml:space="preserve">82.4%</w:t>
             </w:r>
           </w:p>
         </w:tc>
@@ -7167,7 +7167,7 @@
               <w:pStyle w:val="Compact"/>
             </w:pPr>
             <w:r>
-              <w:t xml:space="preserve">90.8%</w:t>
+              <w:t xml:space="preserve">89.3%</w:t>
             </w:r>
           </w:p>
         </w:tc>
@@ -7224,7 +7224,7 @@
               <w:pStyle w:val="Compact"/>
             </w:pPr>
             <w:r>
-              <w:t xml:space="preserve">94.8%</w:t>
+              <w:t xml:space="preserve">93.8%</w:t>
             </w:r>
           </w:p>
         </w:tc>
@@ -7281,7 +7281,7 @@
               <w:pStyle w:val="Compact"/>
             </w:pPr>
             <w:r>
-              <w:t xml:space="preserve">90.8%</w:t>
+              <w:t xml:space="preserve">89.3%</w:t>
             </w:r>
           </w:p>
         </w:tc>
@@ -7338,7 +7338,7 @@
               <w:pStyle w:val="Compact"/>
             </w:pPr>
             <w:r>
-              <w:t xml:space="preserve">97.3%</w:t>
+              <w:t xml:space="preserve">96.5%</w:t>
             </w:r>
           </w:p>
         </w:tc>
@@ -7395,7 +7395,7 @@
               <w:pStyle w:val="Compact"/>
             </w:pPr>
             <w:r>
-              <w:t xml:space="preserve">99.2%</w:t>
+              <w:t xml:space="preserve">99.1%</w:t>
             </w:r>
           </w:p>
         </w:tc>
@@ -7452,18 +7452,18 @@
               <w:pStyle w:val="Compact"/>
             </w:pPr>
             <w:r>
-              <w:t xml:space="preserve">98.5%</w:t>
-            </w:r>
-          </w:p>
-        </w:tc>
-        <w:tc>
-          <w:tcPr/>
-          <w:p>
-            <w:pPr>
-              <w:pStyle w:val="Compact"/>
-            </w:pPr>
-            <w:r>
-              <w:t xml:space="preserve">88.7%</w:t>
+              <w:t xml:space="preserve">98.4%</w:t>
+            </w:r>
+          </w:p>
+        </w:tc>
+        <w:tc>
+          <w:tcPr/>
+          <w:p>
+            <w:pPr>
+              <w:pStyle w:val="Compact"/>
+            </w:pPr>
+            <w:r>
+              <w:t xml:space="preserve">61.5%</w:t>
             </w:r>
           </w:p>
         </w:tc>
@@ -7520,7 +7520,7 @@
               <w:pStyle w:val="Compact"/>
             </w:pPr>
             <w:r>
-              <w:t xml:space="preserve">16.0%</w:t>
+              <w:t xml:space="preserve">2.5%</w:t>
             </w:r>
           </w:p>
         </w:tc>
@@ -7691,7 +7691,7 @@
               <w:pStyle w:val="Compact"/>
             </w:pPr>
             <w:r>
-              <w:t xml:space="preserve">97.3%</w:t>
+              <w:t xml:space="preserve">87.2%</w:t>
             </w:r>
           </w:p>
         </w:tc>
@@ -7748,7 +7748,7 @@
               <w:pStyle w:val="Compact"/>
             </w:pPr>
             <w:r>
-              <w:t xml:space="preserve">3.6%</w:t>
+              <w:t xml:space="preserve">0.3%</w:t>
             </w:r>
           </w:p>
         </w:tc>

</xml_diff>